<commit_message>
Report: remove development tools line
</commit_message>
<xml_diff>
--- a/REPORT.docx
+++ b/REPORT.docx
@@ -1297,15 +1297,6 @@
     </w:p>
     <w:p>
       <w:pPr>
-        <w:spacing w:lineRule="auto"/>
-      </w:pPr>
-      <w:r>
-        <w:rPr/>
-        <w:t xml:space="preserve">Development tools: Visual Studio Code, Git and GitHub, and an AI coding assistant (Anthropic's Claude), which was used to help write the code, tests and documentation.</w:t>
-      </w:r>
-    </w:p>
-    <w:p>
-      <w:pPr>
         <w:pStyle w:val="Heading2"/>
         <w:spacing w:lineRule="auto"/>
       </w:pPr>
@@ -5447,12 +5438,12 @@
           <wp:inline distB="0" distL="0" distR="0" distT="0">
             <wp:extent cx="5972810" cy="3733006"/>
             <wp:effectExtent b="0" l="0" r="0" t="0"/>
-            <wp:docPr id="1" name="image-pr50bYoSwAwFtd6UOHznW.png"/>
+            <wp:docPr id="1" name="image-ToYYBFDBNjA9snoI7U76Y.png"/>
             <a:graphic>
               <a:graphicData uri="http://schemas.openxmlformats.org/drawingml/2006/picture">
                 <pic:pic>
                   <pic:nvPicPr>
-                    <pic:cNvPr id="1" name="image-pr50bYoSwAwFtd6UOHznW.png" descr=""/>
+                    <pic:cNvPr id="1" name="image-ToYYBFDBNjA9snoI7U76Y.png" descr=""/>
                     <pic:cNvPicPr/>
                   </pic:nvPicPr>
                   <pic:blipFill>
@@ -5502,12 +5493,12 @@
           <wp:inline distB="0" distL="0" distR="0" distT="0">
             <wp:extent cx="5972810" cy="3733006"/>
             <wp:effectExtent b="0" l="0" r="0" t="0"/>
-            <wp:docPr id="2" name="image-Z7VqgUURdLRwVaoFZHM27.png"/>
+            <wp:docPr id="2" name="image-p4SPHMN1AXfqQDbf1cC6h.png"/>
             <a:graphic>
               <a:graphicData uri="http://schemas.openxmlformats.org/drawingml/2006/picture">
                 <pic:pic>
                   <pic:nvPicPr>
-                    <pic:cNvPr id="2" name="image-Z7VqgUURdLRwVaoFZHM27.png" descr=""/>
+                    <pic:cNvPr id="2" name="image-p4SPHMN1AXfqQDbf1cC6h.png" descr=""/>
                     <pic:cNvPicPr/>
                   </pic:nvPicPr>
                   <pic:blipFill>
@@ -5557,12 +5548,12 @@
           <wp:inline distB="0" distL="0" distR="0" distT="0">
             <wp:extent cx="5972810" cy="3733006"/>
             <wp:effectExtent b="0" l="0" r="0" t="0"/>
-            <wp:docPr id="3" name="image-YzZh9rNt1nTZ8306ysP2z.png"/>
+            <wp:docPr id="3" name="image-e3eMg9xUtkc2BlI4bwWQx.png"/>
             <a:graphic>
               <a:graphicData uri="http://schemas.openxmlformats.org/drawingml/2006/picture">
                 <pic:pic>
                   <pic:nvPicPr>
-                    <pic:cNvPr id="3" name="image-YzZh9rNt1nTZ8306ysP2z.png" descr=""/>
+                    <pic:cNvPr id="3" name="image-e3eMg9xUtkc2BlI4bwWQx.png" descr=""/>
                     <pic:cNvPicPr/>
                   </pic:nvPicPr>
                   <pic:blipFill>
@@ -5612,12 +5603,12 @@
           <wp:inline distB="0" distL="0" distR="0" distT="0">
             <wp:extent cx="5972810" cy="3733006"/>
             <wp:effectExtent b="0" l="0" r="0" t="0"/>
-            <wp:docPr id="4" name="image-o1IB_MqDR_suuG1JB-lvc.png"/>
+            <wp:docPr id="4" name="image-zNNRtZv-hL4pE0UW8ig3M.png"/>
             <a:graphic>
               <a:graphicData uri="http://schemas.openxmlformats.org/drawingml/2006/picture">
                 <pic:pic>
                   <pic:nvPicPr>
-                    <pic:cNvPr id="4" name="image-o1IB_MqDR_suuG1JB-lvc.png" descr=""/>
+                    <pic:cNvPr id="4" name="image-zNNRtZv-hL4pE0UW8ig3M.png" descr=""/>
                     <pic:cNvPicPr/>
                   </pic:nvPicPr>
                   <pic:blipFill>
@@ -5667,12 +5658,12 @@
           <wp:inline distB="0" distL="0" distR="0" distT="0">
             <wp:extent cx="5972810" cy="3733006"/>
             <wp:effectExtent b="0" l="0" r="0" t="0"/>
-            <wp:docPr id="5" name="image-HiM_QsxQ_0mQmfevbiYzR.png"/>
+            <wp:docPr id="5" name="image-6JD1hA7hImKe1kETDHzjt.png"/>
             <a:graphic>
               <a:graphicData uri="http://schemas.openxmlformats.org/drawingml/2006/picture">
                 <pic:pic>
                   <pic:nvPicPr>
-                    <pic:cNvPr id="5" name="image-HiM_QsxQ_0mQmfevbiYzR.png" descr=""/>
+                    <pic:cNvPr id="5" name="image-6JD1hA7hImKe1kETDHzjt.png" descr=""/>
                     <pic:cNvPicPr/>
                   </pic:nvPicPr>
                   <pic:blipFill>
@@ -5722,12 +5713,12 @@
           <wp:inline distB="0" distL="0" distR="0" distT="0">
             <wp:extent cx="5972810" cy="3733006"/>
             <wp:effectExtent b="0" l="0" r="0" t="0"/>
-            <wp:docPr id="6" name="image-We8R15i4cFXbVNXk5gaZx.png"/>
+            <wp:docPr id="6" name="image-jHVXPyeEKYGsQ4T8E99Dy.png"/>
             <a:graphic>
               <a:graphicData uri="http://schemas.openxmlformats.org/drawingml/2006/picture">
                 <pic:pic>
                   <pic:nvPicPr>
-                    <pic:cNvPr id="6" name="image-We8R15i4cFXbVNXk5gaZx.png" descr=""/>
+                    <pic:cNvPr id="6" name="image-jHVXPyeEKYGsQ4T8E99Dy.png" descr=""/>
                     <pic:cNvPicPr/>
                   </pic:nvPicPr>
                   <pic:blipFill>
@@ -5777,12 +5768,12 @@
           <wp:inline distB="0" distL="0" distR="0" distT="0">
             <wp:extent cx="5972810" cy="3733006"/>
             <wp:effectExtent b="0" l="0" r="0" t="0"/>
-            <wp:docPr id="7" name="image-Dm4vp3vgPkCOG3KltxhqU.png"/>
+            <wp:docPr id="7" name="image-iwrXK8fec2DZBET1QM6Qd.png"/>
             <a:graphic>
               <a:graphicData uri="http://schemas.openxmlformats.org/drawingml/2006/picture">
                 <pic:pic>
                   <pic:nvPicPr>
-                    <pic:cNvPr id="7" name="image-Dm4vp3vgPkCOG3KltxhqU.png" descr=""/>
+                    <pic:cNvPr id="7" name="image-iwrXK8fec2DZBET1QM6Qd.png" descr=""/>
                     <pic:cNvPicPr/>
                   </pic:nvPicPr>
                   <pic:blipFill>
@@ -5832,12 +5823,12 @@
           <wp:inline distB="0" distL="0" distR="0" distT="0">
             <wp:extent cx="5972810" cy="3733006"/>
             <wp:effectExtent b="0" l="0" r="0" t="0"/>
-            <wp:docPr id="8" name="image-0UBuK6LS6btiFAzW4N_Tr.png"/>
+            <wp:docPr id="8" name="image-hxL36RP2IWZfmwuoPOZ3W.png"/>
             <a:graphic>
               <a:graphicData uri="http://schemas.openxmlformats.org/drawingml/2006/picture">
                 <pic:pic>
                   <pic:nvPicPr>
-                    <pic:cNvPr id="8" name="image-0UBuK6LS6btiFAzW4N_Tr.png" descr=""/>
+                    <pic:cNvPr id="8" name="image-hxL36RP2IWZfmwuoPOZ3W.png" descr=""/>
                     <pic:cNvPicPr/>
                   </pic:nvPicPr>
                   <pic:blipFill>
@@ -5887,12 +5878,12 @@
           <wp:inline distB="0" distL="0" distR="0" distT="0">
             <wp:extent cx="5972810" cy="3733006"/>
             <wp:effectExtent b="0" l="0" r="0" t="0"/>
-            <wp:docPr id="9" name="image-dX9oAIQCag0IeANqmYCSL.png"/>
+            <wp:docPr id="9" name="image-37qro2dsreX4CuMqB8AlA.png"/>
             <a:graphic>
               <a:graphicData uri="http://schemas.openxmlformats.org/drawingml/2006/picture">
                 <pic:pic>
                   <pic:nvPicPr>
-                    <pic:cNvPr id="9" name="image-dX9oAIQCag0IeANqmYCSL.png" descr=""/>
+                    <pic:cNvPr id="9" name="image-37qro2dsreX4CuMqB8AlA.png" descr=""/>
                     <pic:cNvPicPr/>
                   </pic:nvPicPr>
                   <pic:blipFill>
@@ -5942,12 +5933,12 @@
           <wp:inline distB="0" distL="0" distR="0" distT="0">
             <wp:extent cx="5972810" cy="12925773"/>
             <wp:effectExtent b="0" l="0" r="0" t="0"/>
-            <wp:docPr id="10" name="image-80VaGmlBFyb01_rglA_7X.png"/>
+            <wp:docPr id="10" name="image-J2zymF_W10hGvAyvWHp9l.png"/>
             <a:graphic>
               <a:graphicData uri="http://schemas.openxmlformats.org/drawingml/2006/picture">
                 <pic:pic>
                   <pic:nvPicPr>
-                    <pic:cNvPr id="10" name="image-80VaGmlBFyb01_rglA_7X.png" descr=""/>
+                    <pic:cNvPr id="10" name="image-J2zymF_W10hGvAyvWHp9l.png" descr=""/>
                     <pic:cNvPicPr/>
                   </pic:nvPicPr>
                   <pic:blipFill>
@@ -6013,12 +6004,12 @@
           <wp:inline distB="0" distL="0" distR="0" distT="0">
             <wp:extent cx="5972810" cy="1518511"/>
             <wp:effectExtent b="0" l="0" r="0" t="0"/>
-            <wp:docPr id="11" name="image-rKtJupZFmEwc8p--LO5KJ.png"/>
+            <wp:docPr id="11" name="image-o21UpwtVJtKV-MgKr0YPX.png"/>
             <a:graphic>
               <a:graphicData uri="http://schemas.openxmlformats.org/drawingml/2006/picture">
                 <pic:pic>
                   <pic:nvPicPr>
-                    <pic:cNvPr id="11" name="image-rKtJupZFmEwc8p--LO5KJ.png" descr=""/>
+                    <pic:cNvPr id="11" name="image-o21UpwtVJtKV-MgKr0YPX.png" descr=""/>
                     <pic:cNvPicPr/>
                   </pic:nvPicPr>
                   <pic:blipFill>

</xml_diff>

<commit_message>
Report: state the AI coding assistant used (Claude Opus 5.5)
</commit_message>
<xml_diff>
--- a/REPORT.docx
+++ b/REPORT.docx
@@ -1297,6 +1297,15 @@
     </w:p>
     <w:p>
       <w:pPr>
+        <w:spacing w:lineRule="auto"/>
+      </w:pPr>
+      <w:r>
+        <w:rPr/>
+        <w:t xml:space="preserve">Development tools: Visual Studio Code, Git and GitHub, and the AI coding assistant Claude Opus 5.5 (Anthropic), which was used to help write the code, tests and documentation.</w:t>
+      </w:r>
+    </w:p>
+    <w:p>
+      <w:pPr>
         <w:pStyle w:val="Heading2"/>
         <w:spacing w:lineRule="auto"/>
       </w:pPr>
@@ -5438,12 +5447,12 @@
           <wp:inline distB="0" distL="0" distR="0" distT="0">
             <wp:extent cx="5972810" cy="3733006"/>
             <wp:effectExtent b="0" l="0" r="0" t="0"/>
-            <wp:docPr id="1" name="image-ToYYBFDBNjA9snoI7U76Y.png"/>
+            <wp:docPr id="1" name="image-W-mvkA0FTPjJUHHm2pwVr.png"/>
             <a:graphic>
               <a:graphicData uri="http://schemas.openxmlformats.org/drawingml/2006/picture">
                 <pic:pic>
                   <pic:nvPicPr>
-                    <pic:cNvPr id="1" name="image-ToYYBFDBNjA9snoI7U76Y.png" descr=""/>
+                    <pic:cNvPr id="1" name="image-W-mvkA0FTPjJUHHm2pwVr.png" descr=""/>
                     <pic:cNvPicPr/>
                   </pic:nvPicPr>
                   <pic:blipFill>
@@ -5493,12 +5502,12 @@
           <wp:inline distB="0" distL="0" distR="0" distT="0">
             <wp:extent cx="5972810" cy="3733006"/>
             <wp:effectExtent b="0" l="0" r="0" t="0"/>
-            <wp:docPr id="2" name="image-p4SPHMN1AXfqQDbf1cC6h.png"/>
+            <wp:docPr id="2" name="image-VfwxfomRydiDlPWpRQ48Q.png"/>
             <a:graphic>
               <a:graphicData uri="http://schemas.openxmlformats.org/drawingml/2006/picture">
                 <pic:pic>
                   <pic:nvPicPr>
-                    <pic:cNvPr id="2" name="image-p4SPHMN1AXfqQDbf1cC6h.png" descr=""/>
+                    <pic:cNvPr id="2" name="image-VfwxfomRydiDlPWpRQ48Q.png" descr=""/>
                     <pic:cNvPicPr/>
                   </pic:nvPicPr>
                   <pic:blipFill>
@@ -5548,12 +5557,12 @@
           <wp:inline distB="0" distL="0" distR="0" distT="0">
             <wp:extent cx="5972810" cy="3733006"/>
             <wp:effectExtent b="0" l="0" r="0" t="0"/>
-            <wp:docPr id="3" name="image-e3eMg9xUtkc2BlI4bwWQx.png"/>
+            <wp:docPr id="3" name="image-scWlpcH4F-oEIi56Lb3I8.png"/>
             <a:graphic>
               <a:graphicData uri="http://schemas.openxmlformats.org/drawingml/2006/picture">
                 <pic:pic>
                   <pic:nvPicPr>
-                    <pic:cNvPr id="3" name="image-e3eMg9xUtkc2BlI4bwWQx.png" descr=""/>
+                    <pic:cNvPr id="3" name="image-scWlpcH4F-oEIi56Lb3I8.png" descr=""/>
                     <pic:cNvPicPr/>
                   </pic:nvPicPr>
                   <pic:blipFill>
@@ -5603,12 +5612,12 @@
           <wp:inline distB="0" distL="0" distR="0" distT="0">
             <wp:extent cx="5972810" cy="3733006"/>
             <wp:effectExtent b="0" l="0" r="0" t="0"/>
-            <wp:docPr id="4" name="image-zNNRtZv-hL4pE0UW8ig3M.png"/>
+            <wp:docPr id="4" name="image-nPqwJjCrHqz72O_NIZW-9.png"/>
             <a:graphic>
               <a:graphicData uri="http://schemas.openxmlformats.org/drawingml/2006/picture">
                 <pic:pic>
                   <pic:nvPicPr>
-                    <pic:cNvPr id="4" name="image-zNNRtZv-hL4pE0UW8ig3M.png" descr=""/>
+                    <pic:cNvPr id="4" name="image-nPqwJjCrHqz72O_NIZW-9.png" descr=""/>
                     <pic:cNvPicPr/>
                   </pic:nvPicPr>
                   <pic:blipFill>
@@ -5658,12 +5667,12 @@
           <wp:inline distB="0" distL="0" distR="0" distT="0">
             <wp:extent cx="5972810" cy="3733006"/>
             <wp:effectExtent b="0" l="0" r="0" t="0"/>
-            <wp:docPr id="5" name="image-6JD1hA7hImKe1kETDHzjt.png"/>
+            <wp:docPr id="5" name="image-ROEO0ZtI-hROyDWFYIW3V.png"/>
             <a:graphic>
               <a:graphicData uri="http://schemas.openxmlformats.org/drawingml/2006/picture">
                 <pic:pic>
                   <pic:nvPicPr>
-                    <pic:cNvPr id="5" name="image-6JD1hA7hImKe1kETDHzjt.png" descr=""/>
+                    <pic:cNvPr id="5" name="image-ROEO0ZtI-hROyDWFYIW3V.png" descr=""/>
                     <pic:cNvPicPr/>
                   </pic:nvPicPr>
                   <pic:blipFill>
@@ -5713,12 +5722,12 @@
           <wp:inline distB="0" distL="0" distR="0" distT="0">
             <wp:extent cx="5972810" cy="3733006"/>
             <wp:effectExtent b="0" l="0" r="0" t="0"/>
-            <wp:docPr id="6" name="image-jHVXPyeEKYGsQ4T8E99Dy.png"/>
+            <wp:docPr id="6" name="image-tBGPXfL3SzNUdcxhl73Gu.png"/>
             <a:graphic>
               <a:graphicData uri="http://schemas.openxmlformats.org/drawingml/2006/picture">
                 <pic:pic>
                   <pic:nvPicPr>
-                    <pic:cNvPr id="6" name="image-jHVXPyeEKYGsQ4T8E99Dy.png" descr=""/>
+                    <pic:cNvPr id="6" name="image-tBGPXfL3SzNUdcxhl73Gu.png" descr=""/>
                     <pic:cNvPicPr/>
                   </pic:nvPicPr>
                   <pic:blipFill>
@@ -5768,12 +5777,12 @@
           <wp:inline distB="0" distL="0" distR="0" distT="0">
             <wp:extent cx="5972810" cy="3733006"/>
             <wp:effectExtent b="0" l="0" r="0" t="0"/>
-            <wp:docPr id="7" name="image-iwrXK8fec2DZBET1QM6Qd.png"/>
+            <wp:docPr id="7" name="image-zYrKQ0whSjECE7h9zdUPj.png"/>
             <a:graphic>
               <a:graphicData uri="http://schemas.openxmlformats.org/drawingml/2006/picture">
                 <pic:pic>
                   <pic:nvPicPr>
-                    <pic:cNvPr id="7" name="image-iwrXK8fec2DZBET1QM6Qd.png" descr=""/>
+                    <pic:cNvPr id="7" name="image-zYrKQ0whSjECE7h9zdUPj.png" descr=""/>
                     <pic:cNvPicPr/>
                   </pic:nvPicPr>
                   <pic:blipFill>
@@ -5823,12 +5832,12 @@
           <wp:inline distB="0" distL="0" distR="0" distT="0">
             <wp:extent cx="5972810" cy="3733006"/>
             <wp:effectExtent b="0" l="0" r="0" t="0"/>
-            <wp:docPr id="8" name="image-hxL36RP2IWZfmwuoPOZ3W.png"/>
+            <wp:docPr id="8" name="image-vnDhx5Eh9RuxtiooXkSVl.png"/>
             <a:graphic>
               <a:graphicData uri="http://schemas.openxmlformats.org/drawingml/2006/picture">
                 <pic:pic>
                   <pic:nvPicPr>
-                    <pic:cNvPr id="8" name="image-hxL36RP2IWZfmwuoPOZ3W.png" descr=""/>
+                    <pic:cNvPr id="8" name="image-vnDhx5Eh9RuxtiooXkSVl.png" descr=""/>
                     <pic:cNvPicPr/>
                   </pic:nvPicPr>
                   <pic:blipFill>
@@ -5878,12 +5887,12 @@
           <wp:inline distB="0" distL="0" distR="0" distT="0">
             <wp:extent cx="5972810" cy="3733006"/>
             <wp:effectExtent b="0" l="0" r="0" t="0"/>
-            <wp:docPr id="9" name="image-37qro2dsreX4CuMqB8AlA.png"/>
+            <wp:docPr id="9" name="image-8r9sQURM1qhVbK2VM50WW.png"/>
             <a:graphic>
               <a:graphicData uri="http://schemas.openxmlformats.org/drawingml/2006/picture">
                 <pic:pic>
                   <pic:nvPicPr>
-                    <pic:cNvPr id="9" name="image-37qro2dsreX4CuMqB8AlA.png" descr=""/>
+                    <pic:cNvPr id="9" name="image-8r9sQURM1qhVbK2VM50WW.png" descr=""/>
                     <pic:cNvPicPr/>
                   </pic:nvPicPr>
                   <pic:blipFill>
@@ -5933,12 +5942,12 @@
           <wp:inline distB="0" distL="0" distR="0" distT="0">
             <wp:extent cx="5972810" cy="12925773"/>
             <wp:effectExtent b="0" l="0" r="0" t="0"/>
-            <wp:docPr id="10" name="image-J2zymF_W10hGvAyvWHp9l.png"/>
+            <wp:docPr id="10" name="image-hBY2FHjJhhOaDdW-ADC0_.png"/>
             <a:graphic>
               <a:graphicData uri="http://schemas.openxmlformats.org/drawingml/2006/picture">
                 <pic:pic>
                   <pic:nvPicPr>
-                    <pic:cNvPr id="10" name="image-J2zymF_W10hGvAyvWHp9l.png" descr=""/>
+                    <pic:cNvPr id="10" name="image-hBY2FHjJhhOaDdW-ADC0_.png" descr=""/>
                     <pic:cNvPicPr/>
                   </pic:nvPicPr>
                   <pic:blipFill>
@@ -6004,12 +6013,12 @@
           <wp:inline distB="0" distL="0" distR="0" distT="0">
             <wp:extent cx="5972810" cy="1518511"/>
             <wp:effectExtent b="0" l="0" r="0" t="0"/>
-            <wp:docPr id="11" name="image-o21UpwtVJtKV-MgKr0YPX.png"/>
+            <wp:docPr id="11" name="image-uegW7H1RT-4Ip6zS8vRiR.png"/>
             <a:graphic>
               <a:graphicData uri="http://schemas.openxmlformats.org/drawingml/2006/picture">
                 <pic:pic>
                   <pic:nvPicPr>
-                    <pic:cNvPr id="11" name="image-o21UpwtVJtKV-MgKr0YPX.png" descr=""/>
+                    <pic:cNvPr id="11" name="image-uegW7H1RT-4Ip6zS8vRiR.png" descr=""/>
                     <pic:cNvPicPr/>
                   </pic:nvPicPr>
                   <pic:blipFill>

</xml_diff>

<commit_message>
Student role, deleted accounts, backup and restore points, reports, password demo
- Roles are now admin and student (migration 002 upgrades existing databases)
- Admins can mark accounts as deleted (kept in the database) and restore them
- Full database backup as SQL; restore points that change only roles and deleted status
- Security event log and a reports page
- Salt and pepper demonstration page
- 74 backend tests; README, API, database docs and report updated
</commit_message>
<xml_diff>
--- a/REPORT.docx
+++ b/REPORT.docx
@@ -5,7 +5,7 @@
     <w:sectPr>
       <w:pgSz w:w="12240" w:h="15840" w:orient="portrait"/>
       <w:pgMar w:top="1417" w:right="1417" w:bottom="1247" w:left="1417" w:header="undefined" w:footer="undefined" w:gutter="undefined"/>
-      <w:footerReference r:id="rId19" w:type="default"/>
+      <w:footerReference r:id="rId24" w:type="default"/>
     </w:sectPr>
     <w:p>
       <w:pPr>
@@ -297,43 +297,61 @@
       </w:pPr>
       <w:r>
         <w:rPr/>
-        <w:t xml:space="preserve">11. Implementation details</w:t>
-      </w:r>
-    </w:p>
-    <w:p>
-      <w:pPr>
-        <w:spacing w:lineRule="auto"/>
-      </w:pPr>
-      <w:r>
-        <w:rPr/>
-        <w:t xml:space="preserve">12. Testing</w:t>
-      </w:r>
-    </w:p>
-    <w:p>
-      <w:pPr>
-        <w:spacing w:lineRule="auto"/>
-      </w:pPr>
-      <w:r>
-        <w:rPr/>
-        <w:t xml:space="preserve">13. Limitations and future improvements</w:t>
-      </w:r>
-    </w:p>
-    <w:p>
-      <w:pPr>
-        <w:spacing w:lineRule="auto"/>
-      </w:pPr>
-      <w:r>
-        <w:rPr/>
-        <w:t xml:space="preserve">14. Conclusion</w:t>
-      </w:r>
-    </w:p>
-    <w:p>
-      <w:pPr>
-        <w:spacing w:lineRule="auto"/>
-      </w:pPr>
-      <w:r>
-        <w:rPr/>
-        <w:t xml:space="preserve">15. Instructions for running the application</w:t>
+        <w:t xml:space="preserve">11. Deleted accounts, backup and restore points</w:t>
+      </w:r>
+    </w:p>
+    <w:p>
+      <w:pPr>
+        <w:spacing w:lineRule="auto"/>
+      </w:pPr>
+      <w:r>
+        <w:rPr/>
+        <w:t xml:space="preserve">12. Reports and the password demonstration</w:t>
+      </w:r>
+    </w:p>
+    <w:p>
+      <w:pPr>
+        <w:spacing w:lineRule="auto"/>
+      </w:pPr>
+      <w:r>
+        <w:rPr/>
+        <w:t xml:space="preserve">13. Implementation details</w:t>
+      </w:r>
+    </w:p>
+    <w:p>
+      <w:pPr>
+        <w:spacing w:lineRule="auto"/>
+      </w:pPr>
+      <w:r>
+        <w:rPr/>
+        <w:t xml:space="preserve">14. Testing</w:t>
+      </w:r>
+    </w:p>
+    <w:p>
+      <w:pPr>
+        <w:spacing w:lineRule="auto"/>
+      </w:pPr>
+      <w:r>
+        <w:rPr/>
+        <w:t xml:space="preserve">15. Limitations and future improvements</w:t>
+      </w:r>
+    </w:p>
+    <w:p>
+      <w:pPr>
+        <w:spacing w:lineRule="auto"/>
+      </w:pPr>
+      <w:r>
+        <w:rPr/>
+        <w:t xml:space="preserve">16. Conclusion</w:t>
+      </w:r>
+    </w:p>
+    <w:p>
+      <w:pPr>
+        <w:spacing w:lineRule="auto"/>
+      </w:pPr>
+      <w:r>
+        <w:rPr/>
+        <w:t xml:space="preserve">17. Instructions for running the application</w:t>
       </w:r>
     </w:p>
     <w:p>
@@ -451,7 +469,7 @@
       </w:r>
       <w:r>
         <w:rPr/>
-        <w:t xml:space="preserve">user</w:t>
+        <w:t xml:space="preserve">student</w:t>
       </w:r>
       <w:r>
         <w:rPr/>
@@ -1380,7 +1398,23 @@
       </w:r>
       <w:r>
         <w:rPr/>
-        <w:t xml:space="preserve"> contains the business logic (registration, password check, one-time code, sessions). Other small classes handle passwords, tokens, rate limiting, validation and email.</w:t>
+        <w:t xml:space="preserve"> contains the business logic (registration, password check, one-time code, sessions), </w:t>
+      </w:r>
+      <w:r>
+        <w:rPr/>
+        <w:t xml:space="preserve">AdminService</w:t>
+      </w:r>
+      <w:r>
+        <w:rPr/>
+        <w:t xml:space="preserve"> the administrator features (deleting accounts, backup, restore points, reports, password demo) and </w:t>
+      </w:r>
+      <w:r>
+        <w:rPr/>
+        <w:t xml:space="preserve">AuditLog</w:t>
+      </w:r>
+      <w:r>
+        <w:rPr/>
+        <w:t xml:space="preserve"> the event log. Other small classes handle passwords, tokens, rate limiting, validation and email.</w:t>
       </w:r>
     </w:p>
     <w:p>
@@ -1692,7 +1726,7 @@
               <w:rPr>
                 <w:highlight w:val="lightGray"/>
               </w:rPr>
-              <w:t xml:space="preserve">ENUM('user','admin')</w:t>
+              <w:t xml:space="preserve">ENUM('student','admin')</w:t>
             </w:r>
           </w:p>
           <w:p>
@@ -1712,7 +1746,7 @@
               <w:rPr>
                 <w:highlight w:val="lightGray"/>
               </w:rPr>
-              <w:t xml:space="preserve">user</w:t>
+              <w:t xml:space="preserve">student</w:t>
             </w:r>
           </w:p>
           <w:p>
@@ -1753,6 +1787,35 @@
                 <w:highlight w:val="lightGray"/>
               </w:rPr>
               <w:t xml:space="preserve">last_login_at</w:t>
+            </w:r>
+          </w:p>
+          <w:p>
+            <w:pPr>
+              <w:spacing w:lineRule="auto"/>
+            </w:pPr>
+            <w:r>
+              <w:rPr/>
+              <w:t xml:space="preserve">, </w:t>
+            </w:r>
+          </w:p>
+          <w:p>
+            <w:pPr>
+              <w:spacing w:lineRule="auto"/>
+            </w:pPr>
+            <w:r>
+              <w:rPr>
+                <w:highlight w:val="lightGray"/>
+              </w:rPr>
+              <w:t xml:space="preserve">deleted_at</w:t>
+            </w:r>
+          </w:p>
+          <w:p>
+            <w:pPr>
+              <w:spacing w:lineRule="auto"/>
+            </w:pPr>
+            <w:r>
+              <w:rPr/>
+              <w:t xml:space="preserve"> (set when an admin deletes the account)</w:t>
             </w:r>
           </w:p>
         </w:tc>
@@ -2175,6 +2238,327 @@
           </w:p>
         </w:tc>
       </w:tr>
+      <w:tr>
+        <w:trPr>
+          <w:cantSplit/>
+        </w:trPr>
+        <w:tc>
+          <w:tcPr>
+            <w:tcBorders>
+              <w:top w:val="single" w:sz="1" w:space="0" w:color="000000"/>
+              <w:bottom w:val="single" w:sz="1" w:space="0" w:color="000000"/>
+              <w:left w:val="single" w:sz="1" w:space="0" w:color="000000"/>
+              <w:right w:val="single" w:sz="1" w:space="0" w:color="000000"/>
+            </w:tcBorders>
+          </w:tcPr>
+          <w:p>
+            <w:pPr>
+              <w:spacing w:lineRule="auto"/>
+            </w:pPr>
+            <w:r>
+              <w:rPr>
+                <w:highlight w:val="lightGray"/>
+              </w:rPr>
+              <w:t xml:space="preserve">auth_events</w:t>
+            </w:r>
+          </w:p>
+        </w:tc>
+        <w:tc>
+          <w:tcPr>
+            <w:tcBorders>
+              <w:top w:val="single" w:sz="1" w:space="0" w:color="000000"/>
+              <w:bottom w:val="single" w:sz="1" w:space="0" w:color="000000"/>
+              <w:left w:val="single" w:sz="1" w:space="0" w:color="000000"/>
+              <w:right w:val="single" w:sz="1" w:space="0" w:color="000000"/>
+            </w:tcBorders>
+          </w:tcPr>
+          <w:p>
+            <w:pPr>
+              <w:spacing w:lineRule="auto"/>
+            </w:pPr>
+            <w:r>
+              <w:rPr/>
+              <w:t xml:space="preserve">Log of security events for the reports</w:t>
+            </w:r>
+          </w:p>
+        </w:tc>
+        <w:tc>
+          <w:tcPr>
+            <w:tcBorders>
+              <w:top w:val="single" w:sz="1" w:space="0" w:color="000000"/>
+              <w:bottom w:val="single" w:sz="1" w:space="0" w:color="000000"/>
+              <w:left w:val="single" w:sz="1" w:space="0" w:color="000000"/>
+              <w:right w:val="single" w:sz="1" w:space="0" w:color="000000"/>
+            </w:tcBorders>
+          </w:tcPr>
+          <w:p>
+            <w:pPr>
+              <w:spacing w:lineRule="auto"/>
+            </w:pPr>
+            <w:r>
+              <w:rPr>
+                <w:highlight w:val="lightGray"/>
+              </w:rPr>
+              <w:t xml:space="preserve">event</w:t>
+            </w:r>
+          </w:p>
+          <w:p>
+            <w:pPr>
+              <w:spacing w:lineRule="auto"/>
+            </w:pPr>
+            <w:r>
+              <w:rPr/>
+              <w:t xml:space="preserve">, </w:t>
+            </w:r>
+          </w:p>
+          <w:p>
+            <w:pPr>
+              <w:spacing w:lineRule="auto"/>
+            </w:pPr>
+            <w:r>
+              <w:rPr>
+                <w:highlight w:val="lightGray"/>
+              </w:rPr>
+              <w:t xml:space="preserve">user_id</w:t>
+            </w:r>
+          </w:p>
+          <w:p>
+            <w:pPr>
+              <w:spacing w:lineRule="auto"/>
+            </w:pPr>
+            <w:r>
+              <w:rPr/>
+              <w:t xml:space="preserve"> (foreign key, </w:t>
+            </w:r>
+          </w:p>
+          <w:p>
+            <w:pPr>
+              <w:spacing w:lineRule="auto"/>
+            </w:pPr>
+            <w:r>
+              <w:rPr>
+                <w:highlight w:val="lightGray"/>
+              </w:rPr>
+              <w:t xml:space="preserve">ON DELETE SET NULL</w:t>
+            </w:r>
+          </w:p>
+          <w:p>
+            <w:pPr>
+              <w:spacing w:lineRule="auto"/>
+            </w:pPr>
+            <w:r>
+              <w:rPr/>
+              <w:t xml:space="preserve">), </w:t>
+            </w:r>
+          </w:p>
+          <w:p>
+            <w:pPr>
+              <w:spacing w:lineRule="auto"/>
+            </w:pPr>
+            <w:r>
+              <w:rPr>
+                <w:highlight w:val="lightGray"/>
+              </w:rPr>
+              <w:t xml:space="preserve">ip</w:t>
+            </w:r>
+          </w:p>
+          <w:p>
+            <w:pPr>
+              <w:spacing w:lineRule="auto"/>
+            </w:pPr>
+            <w:r>
+              <w:rPr/>
+              <w:t xml:space="preserve">, </w:t>
+            </w:r>
+          </w:p>
+          <w:p>
+            <w:pPr>
+              <w:spacing w:lineRule="auto"/>
+            </w:pPr>
+            <w:r>
+              <w:rPr>
+                <w:highlight w:val="lightGray"/>
+              </w:rPr>
+              <w:t xml:space="preserve">detail</w:t>
+            </w:r>
+          </w:p>
+          <w:p>
+            <w:pPr>
+              <w:spacing w:lineRule="auto"/>
+            </w:pPr>
+            <w:r>
+              <w:rPr/>
+              <w:t xml:space="preserve">, </w:t>
+            </w:r>
+          </w:p>
+          <w:p>
+            <w:pPr>
+              <w:spacing w:lineRule="auto"/>
+            </w:pPr>
+            <w:r>
+              <w:rPr>
+                <w:highlight w:val="lightGray"/>
+              </w:rPr>
+              <w:t xml:space="preserve">created_at</w:t>
+            </w:r>
+          </w:p>
+        </w:tc>
+      </w:tr>
+      <w:tr>
+        <w:trPr>
+          <w:cantSplit/>
+        </w:trPr>
+        <w:tc>
+          <w:tcPr>
+            <w:tcBorders>
+              <w:top w:val="single" w:sz="1" w:space="0" w:color="000000"/>
+              <w:bottom w:val="single" w:sz="1" w:space="0" w:color="000000"/>
+              <w:left w:val="single" w:sz="1" w:space="0" w:color="000000"/>
+              <w:right w:val="single" w:sz="1" w:space="0" w:color="000000"/>
+            </w:tcBorders>
+          </w:tcPr>
+          <w:p>
+            <w:pPr>
+              <w:spacing w:lineRule="auto"/>
+            </w:pPr>
+            <w:r>
+              <w:rPr>
+                <w:highlight w:val="lightGray"/>
+              </w:rPr>
+              <w:t xml:space="preserve">restore_points</w:t>
+            </w:r>
+          </w:p>
+        </w:tc>
+        <w:tc>
+          <w:tcPr>
+            <w:tcBorders>
+              <w:top w:val="single" w:sz="1" w:space="0" w:color="000000"/>
+              <w:bottom w:val="single" w:sz="1" w:space="0" w:color="000000"/>
+              <w:left w:val="single" w:sz="1" w:space="0" w:color="000000"/>
+              <w:right w:val="single" w:sz="1" w:space="0" w:color="000000"/>
+            </w:tcBorders>
+          </w:tcPr>
+          <w:p>
+            <w:pPr>
+              <w:spacing w:lineRule="auto"/>
+            </w:pPr>
+            <w:r>
+              <w:rPr/>
+              <w:t xml:space="preserve">Saved configurations</w:t>
+            </w:r>
+          </w:p>
+        </w:tc>
+        <w:tc>
+          <w:tcPr>
+            <w:tcBorders>
+              <w:top w:val="single" w:sz="1" w:space="0" w:color="000000"/>
+              <w:bottom w:val="single" w:sz="1" w:space="0" w:color="000000"/>
+              <w:left w:val="single" w:sz="1" w:space="0" w:color="000000"/>
+              <w:right w:val="single" w:sz="1" w:space="0" w:color="000000"/>
+            </w:tcBorders>
+          </w:tcPr>
+          <w:p>
+            <w:pPr>
+              <w:spacing w:lineRule="auto"/>
+            </w:pPr>
+            <w:r>
+              <w:rPr>
+                <w:highlight w:val="lightGray"/>
+              </w:rPr>
+              <w:t xml:space="preserve">label</w:t>
+            </w:r>
+          </w:p>
+          <w:p>
+            <w:pPr>
+              <w:spacing w:lineRule="auto"/>
+            </w:pPr>
+            <w:r>
+              <w:rPr/>
+              <w:t xml:space="preserve">, </w:t>
+            </w:r>
+          </w:p>
+          <w:p>
+            <w:pPr>
+              <w:spacing w:lineRule="auto"/>
+            </w:pPr>
+            <w:r>
+              <w:rPr>
+                <w:highlight w:val="lightGray"/>
+              </w:rPr>
+              <w:t xml:space="preserve">created_by</w:t>
+            </w:r>
+          </w:p>
+          <w:p>
+            <w:pPr>
+              <w:spacing w:lineRule="auto"/>
+            </w:pPr>
+            <w:r>
+              <w:rPr/>
+              <w:t xml:space="preserve">, </w:t>
+            </w:r>
+          </w:p>
+          <w:p>
+            <w:pPr>
+              <w:spacing w:lineRule="auto"/>
+            </w:pPr>
+            <w:r>
+              <w:rPr>
+                <w:highlight w:val="lightGray"/>
+              </w:rPr>
+              <w:t xml:space="preserve">created_at</w:t>
+            </w:r>
+          </w:p>
+          <w:p>
+            <w:pPr>
+              <w:spacing w:lineRule="auto"/>
+            </w:pPr>
+            <w:r>
+              <w:rPr/>
+              <w:t xml:space="preserve">, </w:t>
+            </w:r>
+          </w:p>
+          <w:p>
+            <w:pPr>
+              <w:spacing w:lineRule="auto"/>
+            </w:pPr>
+            <w:r>
+              <w:rPr>
+                <w:highlight w:val="lightGray"/>
+              </w:rPr>
+              <w:t xml:space="preserve">user_count</w:t>
+            </w:r>
+          </w:p>
+          <w:p>
+            <w:pPr>
+              <w:spacing w:lineRule="auto"/>
+            </w:pPr>
+            <w:r>
+              <w:rPr/>
+              <w:t xml:space="preserve">, </w:t>
+            </w:r>
+          </w:p>
+          <w:p>
+            <w:pPr>
+              <w:spacing w:lineRule="auto"/>
+            </w:pPr>
+            <w:r>
+              <w:rPr>
+                <w:highlight w:val="lightGray"/>
+              </w:rPr>
+              <w:t xml:space="preserve">config</w:t>
+            </w:r>
+          </w:p>
+          <w:p>
+            <w:pPr>
+              <w:spacing w:lineRule="auto"/>
+            </w:pPr>
+            <w:r>
+              <w:rPr/>
+              <w:t xml:space="preserve"> (each account's role and deleted status, as JSON)</w:t>
+            </w:r>
+          </w:p>
+        </w:tc>
+      </w:tr>
     </w:tbl>
     <w:p>
       <w:pPr>
@@ -2250,6 +2634,27 @@
       </w:pPr>
       <w:r>
         <w:rPr/>
+        <w:t xml:space="preserve">Deleted accounts are not erased: </w:t>
+      </w:r>
+      <w:r>
+        <w:rPr/>
+        <w:t xml:space="preserve">deleted_at</w:t>
+      </w:r>
+      <w:r>
+        <w:rPr/>
+        <w:t xml:space="preserve"> marks them, so the data stays in the database and can be restored.</w:t>
+      </w:r>
+    </w:p>
+    <w:p>
+      <w:pPr>
+        <w:numPr>
+          <w:ilvl w:val="0"/>
+          <w:numId w:val="3"/>
+        </w:numPr>
+        <w:spacing w:lineRule="auto"/>
+      </w:pPr>
+      <w:r>
+        <w:rPr/>
         <w:t xml:space="preserve">The complete script is </w:t>
       </w:r>
       <w:r>
@@ -2258,7 +2663,39 @@
       </w:r>
       <w:r>
         <w:rPr/>
-        <w:t xml:space="preserve">.</w:t>
+        <w:t xml:space="preserve">. An existing database from the first version is upgraded with </w:t>
+      </w:r>
+      <w:r>
+        <w:rPr/>
+        <w:t xml:space="preserve">backend/database/migrations/002_student_role_backup_reports.sql</w:t>
+      </w:r>
+      <w:r>
+        <w:rPr/>
+        <w:t xml:space="preserve"> (renames the role </w:t>
+      </w:r>
+      <w:r>
+        <w:rPr/>
+        <w:t xml:space="preserve">user</w:t>
+      </w:r>
+      <w:r>
+        <w:rPr/>
+        <w:t xml:space="preserve"> to </w:t>
+      </w:r>
+      <w:r>
+        <w:rPr/>
+        <w:t xml:space="preserve">student</w:t>
+      </w:r>
+      <w:r>
+        <w:rPr/>
+        <w:t xml:space="preserve">, adds </w:t>
+      </w:r>
+      <w:r>
+        <w:rPr/>
+        <w:t xml:space="preserve">deleted_at</w:t>
+      </w:r>
+      <w:r>
+        <w:rPr/>
+        <w:t xml:space="preserve"> and the two new tables).</w:t>
       </w:r>
     </w:p>
     <w:p>
@@ -2303,7 +2740,7 @@
       </w:r>
       <w:r>
         <w:rPr/>
-        <w:t xml:space="preserve">user</w:t>
+        <w:t xml:space="preserve">student</w:t>
       </w:r>
       <w:r>
         <w:rPr/>
@@ -2809,7 +3246,7 @@
       </w:r>
       <w:r>
         <w:rPr/>
-        <w:t xml:space="preserve">user</w:t>
+        <w:t xml:space="preserve">student</w:t>
       </w:r>
       <w:r>
         <w:rPr/>
@@ -2831,15 +3268,15 @@
       </w:r>
       <w:r>
         <w:rPr/>
-        <w:t xml:space="preserve"> and checks the role. The interface hides the Admin menu link from ordinary users, but that is only for usability: the endpoint </w:t>
-      </w:r>
-      <w:r>
-        <w:rPr/>
-        <w:t xml:space="preserve">GET /api/admin/users</w:t>
-      </w:r>
-      <w:r>
-        <w:rPr/>
-        <w:t xml:space="preserve"> returns </w:t>
+        <w:t xml:space="preserve"> and checks the role. The interface hides the administrator menu (Users, Backup, Reports, Password demo) from students, but that is only for usability: every admin endpoint (</w:t>
+      </w:r>
+      <w:r>
+        <w:rPr/>
+        <w:t xml:space="preserve">/api/admin/...</w:t>
+      </w:r>
+      <w:r>
+        <w:rPr/>
+        <w:t xml:space="preserve">) returns </w:t>
       </w:r>
       <w:r>
         <w:rPr/>
@@ -2847,7 +3284,7 @@
       </w:r>
       <w:r>
         <w:rPr/>
-        <w:t xml:space="preserve"> to a normal user and </w:t>
+        <w:t xml:space="preserve"> to a student and </w:t>
       </w:r>
       <w:r>
         <w:rPr/>
@@ -3198,7 +3635,198 @@
       </w:pPr>
       <w:r>
         <w:rPr/>
-        <w:t xml:space="preserve">11. Implementation details</w:t>
+        <w:t xml:space="preserve">11. Deleted accounts, backup and restore points</w:t>
+      </w:r>
+    </w:p>
+    <w:p>
+      <w:pPr>
+        <w:spacing w:lineRule="auto"/>
+      </w:pPr>
+      <w:r>
+        <w:rPr>
+          <w:b/>
+        </w:rPr>
+        <w:t xml:space="preserve">Deleting an account.</w:t>
+      </w:r>
+      <w:r>
+        <w:rPr/>
+        <w:t xml:space="preserve"> On the Users page an administrator can delete an account. The row is not removed: the server sets </w:t>
+      </w:r>
+      <w:r>
+        <w:rPr/>
+        <w:t xml:space="preserve">deleted_at</w:t>
+      </w:r>
+      <w:r>
+        <w:rPr/>
+        <w:t xml:space="preserve">, and the account is then shown as </w:t>
+      </w:r>
+      <w:r>
+        <w:rPr/>
+        <w:t xml:space="preserve">deleted</w:t>
+      </w:r>
+      <w:r>
+        <w:rPr/>
+        <w:t xml:space="preserve"> (struck through) in the list and counted separately. A deleted account cannot log in (it gets the same "Invalid email or password." message as anyone else), its open sessions are ended at once and any pending code is cancelled. As a second line of defence, the session check itself also refuses any account marked as deleted. An administrator cannot delete their own account. A deleted account can be restored with the same data and password.</w:t>
+      </w:r>
+    </w:p>
+    <w:p>
+      <w:pPr>
+        <w:spacing w:lineRule="auto"/>
+      </w:pPr>
+      <w:r>
+        <w:rPr>
+          <w:b/>
+        </w:rPr>
+        <w:t xml:space="preserve">Full database backup.</w:t>
+      </w:r>
+      <w:r>
+        <w:rPr/>
+        <w:t xml:space="preserve"> On the Backup page an administrator downloads the whole database as one SQL file (</w:t>
+      </w:r>
+      <w:r>
+        <w:rPr/>
+        <w:t xml:space="preserve">GET /api/admin/backup</w:t>
+      </w:r>
+      <w:r>
+        <w:rPr/>
+        <w:t xml:space="preserve">): for each of the six tables it contains </w:t>
+      </w:r>
+      <w:r>
+        <w:rPr/>
+        <w:t xml:space="preserve">DROP TABLE</w:t>
+      </w:r>
+      <w:r>
+        <w:rPr/>
+        <w:t xml:space="preserve">, </w:t>
+      </w:r>
+      <w:r>
+        <w:rPr/>
+        <w:t xml:space="preserve">CREATE TABLE</w:t>
+      </w:r>
+      <w:r>
+        <w:rPr/>
+        <w:t xml:space="preserve"> and </w:t>
+      </w:r>
+      <w:r>
+        <w:rPr/>
+        <w:t xml:space="preserve">INSERT</w:t>
+      </w:r>
+      <w:r>
+        <w:rPr/>
+        <w:t xml:space="preserve"> statements with every row. Restoring is done by importing the file into MySQL (phpMyAdmin → Import, or the </w:t>
+      </w:r>
+      <w:r>
+        <w:rPr/>
+        <w:t xml:space="preserve">mysql</w:t>
+      </w:r>
+      <w:r>
+        <w:rPr/>
+        <w:t xml:space="preserve"> command), which replaces all current data with the data in the backup. Password hashes are included, so restored accounts keep their passwords; plain passwords are never in it, and neither is the pepper, because the pepper is not stored in the database. Only administrators can download a backup, and every download is logged.</w:t>
+      </w:r>
+    </w:p>
+    <w:p>
+      <w:pPr>
+        <w:spacing w:lineRule="auto"/>
+      </w:pPr>
+      <w:r>
+        <w:rPr>
+          <w:b/>
+        </w:rPr>
+        <w:t xml:space="preserve">Restore points.</w:t>
+      </w:r>
+      <w:r>
+        <w:rPr/>
+        <w:t xml:space="preserve"> A restore point is different from a backup: it saves only the </w:t>
+      </w:r>
+      <w:r>
+        <w:rPr/>
+        <w:t xml:space="preserve">configuration</w:t>
+      </w:r>
+      <w:r>
+        <w:rPr/>
+        <w:t xml:space="preserve">, that is, each account's role and whether it is deleted. Applying a restore point puts that configuration back and changes nothing else: names, emails and password hashes stay as they are, and accounts created after the restore point are left alone. This lets an administrator undo, for example, a wrong role change or a mistaken deletion without touching any data. To avoid locking themselves out, the server refuses to apply a restore point that would remove the administrator's own admin access. Sessions of accounts that the restore point marks as deleted are ended.</w:t>
+      </w:r>
+    </w:p>
+    <w:p>
+      <w:pPr>
+        <w:pStyle w:val="Heading2"/>
+        <w:spacing w:lineRule="auto"/>
+      </w:pPr>
+      <w:r>
+        <w:rPr/>
+        <w:t xml:space="preserve">12. Reports and the password demonstration</w:t>
+      </w:r>
+    </w:p>
+    <w:p>
+      <w:pPr>
+        <w:spacing w:lineRule="auto"/>
+      </w:pPr>
+      <w:r>
+        <w:rPr>
+          <w:b/>
+        </w:rPr>
+        <w:t xml:space="preserve">Event log and reports.</w:t>
+      </w:r>
+      <w:r>
+        <w:rPr/>
+        <w:t xml:space="preserve"> The server records security events in the </w:t>
+      </w:r>
+      <w:r>
+        <w:rPr/>
+        <w:t xml:space="preserve">auth_events</w:t>
+      </w:r>
+      <w:r>
+        <w:rPr/>
+        <w:t xml:space="preserve"> table: registrations, correct passwords, failed logins (an unknown email is stored masked, for example </w:t>
+      </w:r>
+      <w:r>
+        <w:rPr/>
+        <w:t xml:space="preserve">n***@example.com</w:t>
+      </w:r>
+      <w:r>
+        <w:rPr/>
+        <w:t xml:space="preserve">), wrong codes, successful logins, logouts and every administrator action (delete, restore, backup, restore points). Passwords and codes are never written to the log. The Reports page shows the number of accounts by role and status, active sessions, the number of restore points and the time of the last backup; successful logins per day for the last seven days; the count of each event type; and the 25 most recent events with time, account, detail and IP address. In the browser the page can be printed or saved as PDF.</w:t>
+      </w:r>
+    </w:p>
+    <w:p>
+      <w:pPr>
+        <w:spacing w:lineRule="auto"/>
+      </w:pPr>
+      <w:r>
+        <w:rPr>
+          <w:b/>
+        </w:rPr>
+        <w:t xml:space="preserve">Password demonstration.</w:t>
+      </w:r>
+      <w:r>
+        <w:rPr/>
+        <w:t xml:space="preserve"> To show salt and pepper working, the Password demo page (administrators only) takes any sample password and shows each step: the password combined with the pepper using HMAC-SHA256 (only a shortened result is shown and the pepper itself never leaves the server); the random salt; the final Argon2id hash; a second hash of the same password with a different salt and therefore a different result; and three checks with </w:t>
+      </w:r>
+      <w:r>
+        <w:rPr/>
+        <w:t xml:space="preserve">password_verify()</w:t>
+      </w:r>
+      <w:r>
+        <w:rPr/>
+        <w:t xml:space="preserve">: the correct password is accepted, a wrong password is rejected, and the correct password </w:t>
+      </w:r>
+      <w:r>
+        <w:rPr/>
+        <w:t xml:space="preserve">without the pepper</w:t>
+      </w:r>
+      <w:r>
+        <w:rPr/>
+        <w:t xml:space="preserve"> is rejected. Nothing typed on this page is saved or logged.</w:t>
+      </w:r>
+    </w:p>
+    <w:p>
+      <w:pPr>
+        <w:pStyle w:val="Heading2"/>
+        <w:spacing w:lineRule="auto"/>
+      </w:pPr>
+      <w:r>
+        <w:rPr/>
+        <w:t xml:space="preserve">13. Implementation details</w:t>
       </w:r>
     </w:p>
     <w:tbl>
@@ -3398,7 +4026,7 @@
             </w:pPr>
             <w:r>
               <w:rPr/>
-              <w:t xml:space="preserve">Salt and pepper</w:t>
+              <w:t xml:space="preserve">Deleting accounts, backup, restore points, reports, password demo</w:t>
             </w:r>
           </w:p>
         </w:tc>
@@ -3419,7 +4047,7 @@
               <w:rPr>
                 <w:highlight w:val="lightGray"/>
               </w:rPr>
-              <w:t xml:space="preserve">backend/src/Security/Passwords.php</w:t>
+              <w:t xml:space="preserve">backend/src/Services/AdminService.php</w:t>
             </w:r>
           </w:p>
         </w:tc>
@@ -3443,7 +4071,7 @@
             </w:pPr>
             <w:r>
               <w:rPr/>
-              <w:t xml:space="preserve">Secure random values</w:t>
+              <w:t xml:space="preserve">Event log</w:t>
             </w:r>
           </w:p>
         </w:tc>
@@ -3464,7 +4092,7 @@
               <w:rPr>
                 <w:highlight w:val="lightGray"/>
               </w:rPr>
-              <w:t xml:space="preserve">backend/src/Security/Tokens.php</w:t>
+              <w:t xml:space="preserve">backend/src/Services/AuditLog.php</w:t>
             </w:r>
           </w:p>
         </w:tc>
@@ -3488,7 +4116,7 @@
             </w:pPr>
             <w:r>
               <w:rPr/>
-              <w:t xml:space="preserve">Rate limiting</w:t>
+              <w:t xml:space="preserve">Salt and pepper</w:t>
             </w:r>
           </w:p>
         </w:tc>
@@ -3509,7 +4137,7 @@
               <w:rPr>
                 <w:highlight w:val="lightGray"/>
               </w:rPr>
-              <w:t xml:space="preserve">backend/src/Security/RateLimiter.php</w:t>
+              <w:t xml:space="preserve">backend/src/Security/Passwords.php</w:t>
             </w:r>
           </w:p>
         </w:tc>
@@ -3533,7 +4161,7 @@
             </w:pPr>
             <w:r>
               <w:rPr/>
-              <w:t xml:space="preserve">Email (SMTP) and development delivery</w:t>
+              <w:t xml:space="preserve">Secure random values</w:t>
             </w:r>
           </w:p>
         </w:tc>
@@ -3554,7 +4182,7 @@
               <w:rPr>
                 <w:highlight w:val="lightGray"/>
               </w:rPr>
-              <w:t xml:space="preserve">backend/src/Mail/</w:t>
+              <w:t xml:space="preserve">backend/src/Security/Tokens.php</w:t>
             </w:r>
           </w:p>
         </w:tc>
@@ -3578,7 +4206,7 @@
             </w:pPr>
             <w:r>
               <w:rPr/>
-              <w:t xml:space="preserve">Validation</w:t>
+              <w:t xml:space="preserve">Rate limiting</w:t>
             </w:r>
           </w:p>
         </w:tc>
@@ -3599,27 +4227,7 @@
               <w:rPr>
                 <w:highlight w:val="lightGray"/>
               </w:rPr>
-              <w:t xml:space="preserve">backend/src/Validation/Validator.php</w:t>
-            </w:r>
-          </w:p>
-          <w:p>
-            <w:pPr>
-              <w:spacing w:lineRule="auto"/>
-            </w:pPr>
-            <w:r>
-              <w:rPr/>
-              <w:t xml:space="preserve">, </w:t>
-            </w:r>
-          </w:p>
-          <w:p>
-            <w:pPr>
-              <w:spacing w:lineRule="auto"/>
-            </w:pPr>
-            <w:r>
-              <w:rPr>
-                <w:highlight w:val="lightGray"/>
-              </w:rPr>
-              <w:t xml:space="preserve">mobile/src/lib/validation.ts</w:t>
+              <w:t xml:space="preserve">backend/src/Security/RateLimiter.php</w:t>
             </w:r>
           </w:p>
         </w:tc>
@@ -3643,7 +4251,7 @@
             </w:pPr>
             <w:r>
               <w:rPr/>
-              <w:t xml:space="preserve">Configuration safety checks</w:t>
+              <w:t xml:space="preserve">Email (SMTP) and development delivery</w:t>
             </w:r>
           </w:p>
         </w:tc>
@@ -3664,7 +4272,7 @@
               <w:rPr>
                 <w:highlight w:val="lightGray"/>
               </w:rPr>
-              <w:t xml:space="preserve">backend/src/Config.php</w:t>
+              <w:t xml:space="preserve">backend/src/Mail/</w:t>
             </w:r>
           </w:p>
         </w:tc>
@@ -3688,7 +4296,7 @@
             </w:pPr>
             <w:r>
               <w:rPr/>
-              <w:t xml:space="preserve">Database schema</w:t>
+              <w:t xml:space="preserve">Validation</w:t>
             </w:r>
           </w:p>
         </w:tc>
@@ -3709,7 +4317,27 @@
               <w:rPr>
                 <w:highlight w:val="lightGray"/>
               </w:rPr>
-              <w:t xml:space="preserve">backend/database/schema.sql</w:t>
+              <w:t xml:space="preserve">backend/src/Validation/Validator.php</w:t>
+            </w:r>
+          </w:p>
+          <w:p>
+            <w:pPr>
+              <w:spacing w:lineRule="auto"/>
+            </w:pPr>
+            <w:r>
+              <w:rPr/>
+              <w:t xml:space="preserve">, </w:t>
+            </w:r>
+          </w:p>
+          <w:p>
+            <w:pPr>
+              <w:spacing w:lineRule="auto"/>
+            </w:pPr>
+            <w:r>
+              <w:rPr>
+                <w:highlight w:val="lightGray"/>
+              </w:rPr>
+              <w:t xml:space="preserve">mobile/src/lib/validation.ts</w:t>
             </w:r>
           </w:p>
         </w:tc>
@@ -3733,7 +4361,7 @@
             </w:pPr>
             <w:r>
               <w:rPr/>
-              <w:t xml:space="preserve">Command-line tools</w:t>
+              <w:t xml:space="preserve">Configuration safety checks</w:t>
             </w:r>
           </w:p>
         </w:tc>
@@ -3754,47 +4382,7 @@
               <w:rPr>
                 <w:highlight w:val="lightGray"/>
               </w:rPr>
-              <w:t xml:space="preserve">backend/bin/setup-db.php</w:t>
-            </w:r>
-          </w:p>
-          <w:p>
-            <w:pPr>
-              <w:spacing w:lineRule="auto"/>
-            </w:pPr>
-            <w:r>
-              <w:rPr/>
-              <w:t xml:space="preserve">, </w:t>
-            </w:r>
-          </w:p>
-          <w:p>
-            <w:pPr>
-              <w:spacing w:lineRule="auto"/>
-            </w:pPr>
-            <w:r>
-              <w:rPr>
-                <w:highlight w:val="lightGray"/>
-              </w:rPr>
-              <w:t xml:space="preserve">set-role.php</w:t>
-            </w:r>
-          </w:p>
-          <w:p>
-            <w:pPr>
-              <w:spacing w:lineRule="auto"/>
-            </w:pPr>
-            <w:r>
-              <w:rPr/>
-              <w:t xml:space="preserve">, </w:t>
-            </w:r>
-          </w:p>
-          <w:p>
-            <w:pPr>
-              <w:spacing w:lineRule="auto"/>
-            </w:pPr>
-            <w:r>
-              <w:rPr>
-                <w:highlight w:val="lightGray"/>
-              </w:rPr>
-              <w:t xml:space="preserve">generate-secret.php</w:t>
+              <w:t xml:space="preserve">backend/src/Config.php</w:t>
             </w:r>
           </w:p>
         </w:tc>
@@ -3818,7 +4406,7 @@
             </w:pPr>
             <w:r>
               <w:rPr/>
-              <w:t xml:space="preserve">App screens</w:t>
+              <w:t xml:space="preserve">Database schema and upgrade</w:t>
             </w:r>
           </w:p>
         </w:tc>
@@ -3839,7 +4427,27 @@
               <w:rPr>
                 <w:highlight w:val="lightGray"/>
               </w:rPr>
-              <w:t xml:space="preserve">mobile/app/</w:t>
+              <w:t xml:space="preserve">backend/database/schema.sql</w:t>
+            </w:r>
+          </w:p>
+          <w:p>
+            <w:pPr>
+              <w:spacing w:lineRule="auto"/>
+            </w:pPr>
+            <w:r>
+              <w:rPr/>
+              <w:t xml:space="preserve">, </w:t>
+            </w:r>
+          </w:p>
+          <w:p>
+            <w:pPr>
+              <w:spacing w:lineRule="auto"/>
+            </w:pPr>
+            <w:r>
+              <w:rPr>
+                <w:highlight w:val="lightGray"/>
+              </w:rPr>
+              <w:t xml:space="preserve">backend/database/migrations/</w:t>
             </w:r>
           </w:p>
         </w:tc>
@@ -3863,6 +4471,136 @@
             </w:pPr>
             <w:r>
               <w:rPr/>
+              <w:t xml:space="preserve">Command-line tools</w:t>
+            </w:r>
+          </w:p>
+        </w:tc>
+        <w:tc>
+          <w:tcPr>
+            <w:tcBorders>
+              <w:top w:val="single" w:sz="1" w:space="0" w:color="000000"/>
+              <w:bottom w:val="single" w:sz="1" w:space="0" w:color="000000"/>
+              <w:left w:val="single" w:sz="1" w:space="0" w:color="000000"/>
+              <w:right w:val="single" w:sz="1" w:space="0" w:color="000000"/>
+            </w:tcBorders>
+          </w:tcPr>
+          <w:p>
+            <w:pPr>
+              <w:spacing w:lineRule="auto"/>
+            </w:pPr>
+            <w:r>
+              <w:rPr>
+                <w:highlight w:val="lightGray"/>
+              </w:rPr>
+              <w:t xml:space="preserve">backend/bin/setup-db.php</w:t>
+            </w:r>
+          </w:p>
+          <w:p>
+            <w:pPr>
+              <w:spacing w:lineRule="auto"/>
+            </w:pPr>
+            <w:r>
+              <w:rPr/>
+              <w:t xml:space="preserve">, </w:t>
+            </w:r>
+          </w:p>
+          <w:p>
+            <w:pPr>
+              <w:spacing w:lineRule="auto"/>
+            </w:pPr>
+            <w:r>
+              <w:rPr>
+                <w:highlight w:val="lightGray"/>
+              </w:rPr>
+              <w:t xml:space="preserve">set-role.php</w:t>
+            </w:r>
+          </w:p>
+          <w:p>
+            <w:pPr>
+              <w:spacing w:lineRule="auto"/>
+            </w:pPr>
+            <w:r>
+              <w:rPr/>
+              <w:t xml:space="preserve">, </w:t>
+            </w:r>
+          </w:p>
+          <w:p>
+            <w:pPr>
+              <w:spacing w:lineRule="auto"/>
+            </w:pPr>
+            <w:r>
+              <w:rPr>
+                <w:highlight w:val="lightGray"/>
+              </w:rPr>
+              <w:t xml:space="preserve">generate-secret.php</w:t>
+            </w:r>
+          </w:p>
+        </w:tc>
+      </w:tr>
+      <w:tr>
+        <w:trPr>
+          <w:cantSplit/>
+        </w:trPr>
+        <w:tc>
+          <w:tcPr>
+            <w:tcBorders>
+              <w:top w:val="single" w:sz="1" w:space="0" w:color="000000"/>
+              <w:bottom w:val="single" w:sz="1" w:space="0" w:color="000000"/>
+              <w:left w:val="single" w:sz="1" w:space="0" w:color="000000"/>
+              <w:right w:val="single" w:sz="1" w:space="0" w:color="000000"/>
+            </w:tcBorders>
+          </w:tcPr>
+          <w:p>
+            <w:pPr>
+              <w:spacing w:lineRule="auto"/>
+            </w:pPr>
+            <w:r>
+              <w:rPr/>
+              <w:t xml:space="preserve">App screens</w:t>
+            </w:r>
+          </w:p>
+        </w:tc>
+        <w:tc>
+          <w:tcPr>
+            <w:tcBorders>
+              <w:top w:val="single" w:sz="1" w:space="0" w:color="000000"/>
+              <w:bottom w:val="single" w:sz="1" w:space="0" w:color="000000"/>
+              <w:left w:val="single" w:sz="1" w:space="0" w:color="000000"/>
+              <w:right w:val="single" w:sz="1" w:space="0" w:color="000000"/>
+            </w:tcBorders>
+          </w:tcPr>
+          <w:p>
+            <w:pPr>
+              <w:spacing w:lineRule="auto"/>
+            </w:pPr>
+            <w:r>
+              <w:rPr>
+                <w:highlight w:val="lightGray"/>
+              </w:rPr>
+              <w:t xml:space="preserve">mobile/app/</w:t>
+            </w:r>
+          </w:p>
+        </w:tc>
+      </w:tr>
+      <w:tr>
+        <w:trPr>
+          <w:cantSplit/>
+        </w:trPr>
+        <w:tc>
+          <w:tcPr>
+            <w:tcBorders>
+              <w:top w:val="single" w:sz="1" w:space="0" w:color="000000"/>
+              <w:bottom w:val="single" w:sz="1" w:space="0" w:color="000000"/>
+              <w:left w:val="single" w:sz="1" w:space="0" w:color="000000"/>
+              <w:right w:val="single" w:sz="1" w:space="0" w:color="000000"/>
+            </w:tcBorders>
+          </w:tcPr>
+          <w:p>
+            <w:pPr>
+              <w:spacing w:lineRule="auto"/>
+            </w:pPr>
+            <w:r>
+              <w:rPr/>
               <w:t xml:space="preserve">API client, session state, secure storage</w:t>
             </w:r>
           </w:p>
@@ -3944,7 +4682,7 @@
       </w:pPr>
       <w:r>
         <w:rPr/>
-        <w:t xml:space="preserve">The interface is deliberately simple: a header bar with the application name and (when logged in) the menu links Dashboard, Profile, Admin (administrators only) and Logout, with the page content below it. Forms are a single column with a maximum width, so the same layout works on a phone and in a desktop browser. The admin user list is a plain table that scrolls sideways on narrow screens. Forms show a loading state on the button, field-level errors and readable messages.</w:t>
+        <w:t xml:space="preserve">The interface is deliberately simple: a header bar with the application name and (when logged in) the menu links Dashboard, Profile and Logout, plus Users, Backup, Reports and Password demo for administrators, with the page content below it. Forms are a single column with a maximum width, so the same layout works on a phone and in a desktop browser. The admin user list is a plain table that scrolls sideways on narrow screens. Forms show a loading state on the button, field-level errors and readable messages.</w:t>
       </w:r>
     </w:p>
     <w:p>
@@ -3954,7 +4692,7 @@
       </w:pPr>
       <w:r>
         <w:rPr/>
-        <w:t xml:space="preserve">12. Testing</w:t>
+        <w:t xml:space="preserve">14. Testing</w:t>
       </w:r>
     </w:p>
     <w:p>
@@ -3964,7 +4702,7 @@
       </w:pPr>
       <w:r>
         <w:rPr/>
-        <w:t xml:space="preserve">12.1 Automated backend tests (PHP)</w:t>
+        <w:t xml:space="preserve">14.1 Automated backend tests (PHP)</w:t>
       </w:r>
     </w:p>
     <w:p>
@@ -3977,7 +4715,7 @@
       </w:r>
       <w:r>
         <w:rPr/>
-        <w:t xml:space="preserve"> contains 63 tests that call the API kernel directly against a separate test database (</w:t>
+        <w:t xml:space="preserve"> contains 74 tests that call the API kernel directly against a separate test database (</w:t>
       </w:r>
       <w:r>
         <w:rPr/>
@@ -4436,6 +5174,51 @@
           </w:p>
         </w:tc>
       </w:tr>
+      <w:tr>
+        <w:trPr>
+          <w:cantSplit/>
+        </w:trPr>
+        <w:tc>
+          <w:tcPr>
+            <w:tcBorders>
+              <w:top w:val="single" w:sz="1" w:space="0" w:color="000000"/>
+              <w:bottom w:val="single" w:sz="1" w:space="0" w:color="000000"/>
+              <w:left w:val="single" w:sz="1" w:space="0" w:color="000000"/>
+              <w:right w:val="single" w:sz="1" w:space="0" w:color="000000"/>
+            </w:tcBorders>
+          </w:tcPr>
+          <w:p>
+            <w:pPr>
+              <w:spacing w:lineRule="auto"/>
+            </w:pPr>
+            <w:r>
+              <w:rPr/>
+              <w:t xml:space="preserve">Every admin endpoint refuses students (403) and visitors (401); deleting marks the account, ends its sessions and blocks login; restoring; no self-delete; CSRF headers on cookie actions; restore points change only roles and deleted status; full backup contents; reports counts; password demo (different salts, pepper never shown, nothing saved)</w:t>
+            </w:r>
+          </w:p>
+        </w:tc>
+        <w:tc>
+          <w:tcPr>
+            <w:tcBorders>
+              <w:top w:val="single" w:sz="1" w:space="0" w:color="000000"/>
+              <w:bottom w:val="single" w:sz="1" w:space="0" w:color="000000"/>
+              <w:left w:val="single" w:sz="1" w:space="0" w:color="000000"/>
+              <w:right w:val="single" w:sz="1" w:space="0" w:color="000000"/>
+            </w:tcBorders>
+          </w:tcPr>
+          <w:p>
+            <w:pPr>
+              <w:spacing w:lineRule="auto"/>
+            </w:pPr>
+            <w:r>
+              <w:rPr>
+                <w:highlight w:val="lightGray"/>
+              </w:rPr>
+              <w:t xml:space="preserve">admin_tools.php</w:t>
+            </w:r>
+          </w:p>
+        </w:tc>
+      </w:tr>
     </w:tbl>
     <w:p>
       <w:pPr>
@@ -4551,16 +5334,24 @@
         <w:rPr>
           <w:rFonts w:ascii="Courier" w:hAnsi="Courier"/>
         </w:rPr>
-        <w:t xml:space="preserve">63 passed, 0 failed (894 assertions) </w:t>
-      </w:r>
-    </w:p>
-    <w:p>
-      <w:pPr>
-        <w:spacing w:lineRule="auto"/>
-      </w:pPr>
-      <w:r>
-        <w:rPr/>
-        <w:t xml:space="preserve">To check that the tests really detect faults, three bugs were deliberately introduced in a copy of the code, one at a time. Each was caught: removing the admin role check failed 2 authorization tests; making codes valid for 99,999 seconds failed the five-minute expiry test; and no longer marking codes as used failed 4 OTP tests (including "a code can be used only once").</w:t>
+        <w:t xml:space="preserve">74 passed, 0 failed (1066 assertions) </w:t>
+      </w:r>
+    </w:p>
+    <w:p>
+      <w:pPr>
+        <w:spacing w:lineRule="auto"/>
+      </w:pPr>
+      <w:r>
+        <w:rPr/>
+        <w:t xml:space="preserve">To check that the tests really detect faults, three bugs were deliberately introduced in a copy of the code, one at a time. Each was caught: removing the admin role check failed 2 authorization tests; making codes valid for 99,999 seconds failed the five-minute expiry test; and no longer marking codes as used failed 4 OTP tests (including "a code can be used only once"). The same was done for the new features: letting deleted accounts keep their sessions, letting a restore point change names, removing the CSRF check on admin actions and showing the full peppered value in the demo were each caught by the new tests. (The first of these was at first </w:t>
+      </w:r>
+      <w:r>
+        <w:rPr/>
+        <w:t xml:space="preserve">not</w:t>
+      </w:r>
+      <w:r>
+        <w:rPr/>
+        <w:t xml:space="preserve"> caught, because deleting an account also ends its sessions; a test that marks an account as deleted directly in the database was added, and it now fails as it should.)</w:t>
       </w:r>
     </w:p>
     <w:p>
@@ -4583,7 +5374,7 @@
       </w:r>
       <w:r>
         <w:rPr/>
-        <w:t xml:space="preserve">), the MySQL form of the rate-limit query and the duplicate-key error code (1062) were not exercised by this run. The schema and the rate-limit query were later used on the online MySQL database (section 12.4), but the test suite itself has not run against MySQL. On a computer where XAMPP or Laragon works, run:</w:t>
+        <w:t xml:space="preserve">), the MySQL form of the rate-limit query and the duplicate-key error code (1062) were not exercised by this run. The schema and the rate-limit query were later used on the online MySQL database (section 14.4), but the test suite itself has not run against MySQL. On a computer where XAMPP or Laragon works, run:</w:t>
       </w:r>
     </w:p>
     <w:p>
@@ -4624,7 +5415,7 @@
       </w:pPr>
       <w:r>
         <w:rPr/>
-        <w:t xml:space="preserve">12.2 Client checks that were actually run</w:t>
+        <w:t xml:space="preserve">14.2 Client checks that were actually run</w:t>
       </w:r>
     </w:p>
     <w:tbl>
@@ -5117,7 +5908,7 @@
       </w:pPr>
       <w:r>
         <w:rPr/>
-        <w:t xml:space="preserve">12.3 End-to-end tests over HTTP and in a browser</w:t>
+        <w:t xml:space="preserve">14.3 End-to-end tests over HTTP and in a browser</w:t>
       </w:r>
     </w:p>
     <w:p>
@@ -5200,11 +5991,11 @@
         <w:rPr>
           <w:b/>
         </w:rPr>
-        <w:t xml:space="preserve">Browser test (60 passed, 0 failed):</w:t>
-      </w:r>
-      <w:r>
-        <w:rPr/>
-        <w:t xml:space="preserve"> the web build was opened in a headless Edge browser and driven through a script in three sessions (desktop standard user, phone-sized administrator, desktop administrator) against the real PHP API.</w:t>
+        <w:t xml:space="preserve">Browser test (72 passed, 0 failed):</w:t>
+      </w:r>
+      <w:r>
+        <w:rPr/>
+        <w:t xml:space="preserve"> the web build was opened in a headless Edge browser and driven through a script in three sessions (desktop student, phone-sized administrator, desktop administrator) against the real PHP API. Besides the login checks below, it deletes and restores an account on the Users page, downloads a full backup, saves and applies a restore point, opens the Reports page, runs the Password demo, and confirms that a student is refused (403) on the Users, Backup, Reports and Password demo pages.</w:t>
       </w:r>
     </w:p>
     <w:p>
@@ -5248,7 +6039,7 @@
       </w:pPr>
       <w:r>
         <w:rPr/>
-        <w:t xml:space="preserve">12.4 Tests of the online version (real MySQL and real email)</w:t>
+        <w:t xml:space="preserve">14.4 Tests of the online version (real MySQL and real email)</w:t>
       </w:r>
     </w:p>
     <w:p>
@@ -5327,15 +6118,7 @@
       </w:r>
       <w:r>
         <w:rPr/>
-        <w:t xml:space="preserve"> headers; registration (new account gets the </w:t>
-      </w:r>
-      <w:r>
-        <w:rPr/>
-        <w:t xml:space="preserve">user</w:t>
-      </w:r>
-      <w:r>
-        <w:rPr/>
-        <w:t xml:space="preserve"> role); duplicate email in different letter case refused (409); invalid input refused (422); wrong password refused with the generic message (this also exercises the MySQL form of the rate-limit query); correct password sends the code </w:t>
+        <w:t xml:space="preserve"> headers; registration (a new account gets the lowest role); duplicate email in different letter case refused (409); invalid input refused (422); wrong password refused with the generic message (this also exercises the MySQL form of the rate-limit query); correct password sends the code </w:t>
       </w:r>
       <w:r>
         <w:rPr>
@@ -5387,6 +6170,43 @@
         <w:rPr>
           <w:b/>
         </w:rPr>
+        <w:t xml:space="preserve">Second round (18 October 2026), after adding the administrator features:</w:t>
+      </w:r>
+      <w:r>
+        <w:rPr/>
+        <w:t xml:space="preserve"> before upgrading, a copy of all live data was saved; then the upgrade script </w:t>
+      </w:r>
+      <w:r>
+        <w:rPr/>
+        <w:t xml:space="preserve">002_student_role_backup_reports.sql</w:t>
+      </w:r>
+      <w:r>
+        <w:rPr/>
+        <w:t xml:space="preserve"> was applied to the live database and the new version was deployed. The 17 live checks passed again. A temporary administrator account was then used for 12 more live checks, all passed: the emailed code was accepted; the user list showed the Argon2id preview; a restore point was saved; a test account was deleted and could no longer log in; applying the restore point brought it back (configuration only); a full backup was downloaded; the reports counted these actions; the password demo used Argon2id, gave two different salts and refused the password without the pepper; and the restored account could log in again. Finally the backup file was </w:t>
+      </w:r>
+      <w:r>
+        <w:rPr>
+          <w:b/>
+        </w:rPr>
+        <w:t xml:space="preserve">imported into a separate, empty MySQL database</w:t>
+      </w:r>
+      <w:r>
+        <w:rPr/>
+        <w:t xml:space="preserve">, and every table had exactly the same number of rows as the original, which shows the backup can really be restored. The temporary accounts were removed afterwards.</w:t>
+      </w:r>
+    </w:p>
+    <w:p>
+      <w:pPr>
+        <w:numPr>
+          <w:ilvl w:val="0"/>
+          <w:numId w:val="10"/>
+        </w:numPr>
+        <w:spacing w:lineRule="auto"/>
+      </w:pPr>
+      <w:r>
+        <w:rPr>
+          <w:b/>
+        </w:rPr>
         <w:t xml:space="preserve">Problem found and fixed:</w:t>
       </w:r>
       <w:r>
@@ -5401,16 +6221,16 @@
       </w:pPr>
       <w:r>
         <w:rPr/>
-        <w:t xml:space="preserve">12.5 Screenshots</w:t>
-      </w:r>
-    </w:p>
-    <w:p>
-      <w:pPr>
-        <w:spacing w:lineRule="auto"/>
-      </w:pPr>
-      <w:r>
-        <w:rPr/>
-        <w:t xml:space="preserve">Figures 1–10 were captured from the web version of the app running against the real PHP API on the local computer (</w:t>
+        <w:t xml:space="preserve">14.5 Screenshots</w:t>
+      </w:r>
+    </w:p>
+    <w:p>
+      <w:pPr>
+        <w:spacing w:lineRule="auto"/>
+      </w:pPr>
+      <w:r>
+        <w:rPr/>
+        <w:t xml:space="preserve">Figures 1–10 and 13–16 were captured from the web version of the app running against the real PHP API on the local computer (</w:t>
       </w:r>
       <w:r>
         <w:rPr/>
@@ -5418,7 +6238,7 @@
       </w:r>
       <w:r>
         <w:rPr/>
-        <w:t xml:space="preserve">, development mode, so the code is shown on screen instead of being emailed). Figure 11 is from the online MySQL database.</w:t>
+        <w:t xml:space="preserve">, development mode, so the code is shown on screen instead of being emailed; that PHP build has no Argon2, so Figure 16 shows bcrypt). Figures 11 and 12 are from the online MySQL database.</w:t>
       </w:r>
     </w:p>
     <w:p>
@@ -5447,12 +6267,12 @@
           <wp:inline distB="0" distL="0" distR="0" distT="0">
             <wp:extent cx="5972810" cy="3733006"/>
             <wp:effectExtent b="0" l="0" r="0" t="0"/>
-            <wp:docPr id="1" name="image-W-mvkA0FTPjJUHHm2pwVr.png"/>
+            <wp:docPr id="1" name="image-N81V2oSUcZpK6d2iBas_R.png"/>
             <a:graphic>
               <a:graphicData uri="http://schemas.openxmlformats.org/drawingml/2006/picture">
                 <pic:pic>
                   <pic:nvPicPr>
-                    <pic:cNvPr id="1" name="image-W-mvkA0FTPjJUHHm2pwVr.png" descr=""/>
+                    <pic:cNvPr id="1" name="image-N81V2oSUcZpK6d2iBas_R.png" descr=""/>
                     <pic:cNvPicPr/>
                   </pic:nvPicPr>
                   <pic:blipFill>
@@ -5502,12 +6322,12 @@
           <wp:inline distB="0" distL="0" distR="0" distT="0">
             <wp:extent cx="5972810" cy="3733006"/>
             <wp:effectExtent b="0" l="0" r="0" t="0"/>
-            <wp:docPr id="2" name="image-VfwxfomRydiDlPWpRQ48Q.png"/>
+            <wp:docPr id="2" name="image-SmUO5lIS9RLCSoxyg7r2V.png"/>
             <a:graphic>
               <a:graphicData uri="http://schemas.openxmlformats.org/drawingml/2006/picture">
                 <pic:pic>
                   <pic:nvPicPr>
-                    <pic:cNvPr id="2" name="image-VfwxfomRydiDlPWpRQ48Q.png" descr=""/>
+                    <pic:cNvPr id="2" name="image-SmUO5lIS9RLCSoxyg7r2V.png" descr=""/>
                     <pic:cNvPicPr/>
                   </pic:nvPicPr>
                   <pic:blipFill>
@@ -5557,12 +6377,12 @@
           <wp:inline distB="0" distL="0" distR="0" distT="0">
             <wp:extent cx="5972810" cy="3733006"/>
             <wp:effectExtent b="0" l="0" r="0" t="0"/>
-            <wp:docPr id="3" name="image-scWlpcH4F-oEIi56Lb3I8.png"/>
+            <wp:docPr id="3" name="image-R11r_AnRFfcgUeS3aLbRK.png"/>
             <a:graphic>
               <a:graphicData uri="http://schemas.openxmlformats.org/drawingml/2006/picture">
                 <pic:pic>
                   <pic:nvPicPr>
-                    <pic:cNvPr id="3" name="image-scWlpcH4F-oEIi56Lb3I8.png" descr=""/>
+                    <pic:cNvPr id="3" name="image-R11r_AnRFfcgUeS3aLbRK.png" descr=""/>
                     <pic:cNvPicPr/>
                   </pic:nvPicPr>
                   <pic:blipFill>
@@ -5612,12 +6432,12 @@
           <wp:inline distB="0" distL="0" distR="0" distT="0">
             <wp:extent cx="5972810" cy="3733006"/>
             <wp:effectExtent b="0" l="0" r="0" t="0"/>
-            <wp:docPr id="4" name="image-nPqwJjCrHqz72O_NIZW-9.png"/>
+            <wp:docPr id="4" name="image-ugEfkKixegxPVS4wvWJmj.png"/>
             <a:graphic>
               <a:graphicData uri="http://schemas.openxmlformats.org/drawingml/2006/picture">
                 <pic:pic>
                   <pic:nvPicPr>
-                    <pic:cNvPr id="4" name="image-nPqwJjCrHqz72O_NIZW-9.png" descr=""/>
+                    <pic:cNvPr id="4" name="image-ugEfkKixegxPVS4wvWJmj.png" descr=""/>
                     <pic:cNvPicPr/>
                   </pic:nvPicPr>
                   <pic:blipFill>
@@ -5667,12 +6487,12 @@
           <wp:inline distB="0" distL="0" distR="0" distT="0">
             <wp:extent cx="5972810" cy="3733006"/>
             <wp:effectExtent b="0" l="0" r="0" t="0"/>
-            <wp:docPr id="5" name="image-ROEO0ZtI-hROyDWFYIW3V.png"/>
+            <wp:docPr id="5" name="image-2lCidSyeVkDn0aGWdZ5aN.png"/>
             <a:graphic>
               <a:graphicData uri="http://schemas.openxmlformats.org/drawingml/2006/picture">
                 <pic:pic>
                   <pic:nvPicPr>
-                    <pic:cNvPr id="5" name="image-ROEO0ZtI-hROyDWFYIW3V.png" descr=""/>
+                    <pic:cNvPr id="5" name="image-2lCidSyeVkDn0aGWdZ5aN.png" descr=""/>
                     <pic:cNvPicPr/>
                   </pic:nvPicPr>
                   <pic:blipFill>
@@ -5722,12 +6542,12 @@
           <wp:inline distB="0" distL="0" distR="0" distT="0">
             <wp:extent cx="5972810" cy="3733006"/>
             <wp:effectExtent b="0" l="0" r="0" t="0"/>
-            <wp:docPr id="6" name="image-tBGPXfL3SzNUdcxhl73Gu.png"/>
+            <wp:docPr id="6" name="image-xz7AKxLmWd8s8vvzvhhKI.png"/>
             <a:graphic>
               <a:graphicData uri="http://schemas.openxmlformats.org/drawingml/2006/picture">
                 <pic:pic>
                   <pic:nvPicPr>
-                    <pic:cNvPr id="6" name="image-tBGPXfL3SzNUdcxhl73Gu.png" descr=""/>
+                    <pic:cNvPr id="6" name="image-xz7AKxLmWd8s8vvzvhhKI.png" descr=""/>
                     <pic:cNvPicPr/>
                   </pic:nvPicPr>
                   <pic:blipFill>
@@ -5777,12 +6597,12 @@
           <wp:inline distB="0" distL="0" distR="0" distT="0">
             <wp:extent cx="5972810" cy="3733006"/>
             <wp:effectExtent b="0" l="0" r="0" t="0"/>
-            <wp:docPr id="7" name="image-zYrKQ0whSjECE7h9zdUPj.png"/>
+            <wp:docPr id="7" name="image-9x5zMPQMiABi1mJHeCP03.png"/>
             <a:graphic>
               <a:graphicData uri="http://schemas.openxmlformats.org/drawingml/2006/picture">
                 <pic:pic>
                   <pic:nvPicPr>
-                    <pic:cNvPr id="7" name="image-zYrKQ0whSjECE7h9zdUPj.png" descr=""/>
+                    <pic:cNvPr id="7" name="image-9x5zMPQMiABi1mJHeCP03.png" descr=""/>
                     <pic:cNvPicPr/>
                   </pic:nvPicPr>
                   <pic:blipFill>
@@ -5832,12 +6652,12 @@
           <wp:inline distB="0" distL="0" distR="0" distT="0">
             <wp:extent cx="5972810" cy="3733006"/>
             <wp:effectExtent b="0" l="0" r="0" t="0"/>
-            <wp:docPr id="8" name="image-vnDhx5Eh9RuxtiooXkSVl.png"/>
+            <wp:docPr id="8" name="image-0xd-_dRvH-vxmqL9aFeiT.png"/>
             <a:graphic>
               <a:graphicData uri="http://schemas.openxmlformats.org/drawingml/2006/picture">
                 <pic:pic>
                   <pic:nvPicPr>
-                    <pic:cNvPr id="8" name="image-vnDhx5Eh9RuxtiooXkSVl.png" descr=""/>
+                    <pic:cNvPr id="8" name="image-0xd-_dRvH-vxmqL9aFeiT.png" descr=""/>
                     <pic:cNvPicPr/>
                   </pic:nvPicPr>
                   <pic:blipFill>
@@ -5873,7 +6693,7 @@
       </w:r>
       <w:r>
         <w:rPr/>
-        <w:t xml:space="preserve"> The admin page for an administrator, listing registered users (no password data is sent).</w:t>
+        <w:t xml:space="preserve"> The Users page for an administrator. Only a shortened preview of each stored hash is sent.</w:t>
       </w:r>
     </w:p>
     <w:p>
@@ -5887,12 +6707,12 @@
           <wp:inline distB="0" distL="0" distR="0" distT="0">
             <wp:extent cx="5972810" cy="3733006"/>
             <wp:effectExtent b="0" l="0" r="0" t="0"/>
-            <wp:docPr id="9" name="image-8r9sQURM1qhVbK2VM50WW.png"/>
+            <wp:docPr id="9" name="image-25sh8UZ7Hy1BjrKYuwt7p.png"/>
             <a:graphic>
               <a:graphicData uri="http://schemas.openxmlformats.org/drawingml/2006/picture">
                 <pic:pic>
                   <pic:nvPicPr>
-                    <pic:cNvPr id="9" name="image-8r9sQURM1qhVbK2VM50WW.png" descr=""/>
+                    <pic:cNvPr id="9" name="image-25sh8UZ7Hy1BjrKYuwt7p.png" descr=""/>
                     <pic:cNvPicPr/>
                   </pic:nvPicPr>
                   <pic:blipFill>
@@ -5942,12 +6762,12 @@
           <wp:inline distB="0" distL="0" distR="0" distT="0">
             <wp:extent cx="5972810" cy="12925773"/>
             <wp:effectExtent b="0" l="0" r="0" t="0"/>
-            <wp:docPr id="10" name="image-hBY2FHjJhhOaDdW-ADC0_.png"/>
+            <wp:docPr id="10" name="image-QZU2W6DGIzn7L963G8IAV.png"/>
             <a:graphic>
               <a:graphicData uri="http://schemas.openxmlformats.org/drawingml/2006/picture">
                 <pic:pic>
                   <pic:nvPicPr>
-                    <pic:cNvPr id="10" name="image-hBY2FHjJhhOaDdW-ADC0_.png" descr=""/>
+                    <pic:cNvPr id="10" name="image-QZU2W6DGIzn7L963G8IAV.png" descr=""/>
                     <pic:cNvPicPr/>
                   </pic:nvPicPr>
                   <pic:blipFill>
@@ -6013,12 +6833,12 @@
           <wp:inline distB="0" distL="0" distR="0" distT="0">
             <wp:extent cx="5972810" cy="1518511"/>
             <wp:effectExtent b="0" l="0" r="0" t="0"/>
-            <wp:docPr id="11" name="image-uegW7H1RT-4Ip6zS8vRiR.png"/>
+            <wp:docPr id="11" name="image-JMMY_uFSvsPAQXmmRuAYj.png"/>
             <a:graphic>
               <a:graphicData uri="http://schemas.openxmlformats.org/drawingml/2006/picture">
                 <pic:pic>
                   <pic:nvPicPr>
-                    <pic:cNvPr id="11" name="image-uegW7H1RT-4Ip6zS8vRiR.png" descr=""/>
+                    <pic:cNvPr id="11" name="image-JMMY_uFSvsPAQXmmRuAYj.png" descr=""/>
                     <pic:cNvPicPr/>
                   </pic:nvPicPr>
                   <pic:blipFill>
@@ -6047,6 +6867,281 @@
         <w:spacing w:lineRule="auto"/>
       </w:pPr>
       <w:r>
+        <w:rPr>
+          <w:b/>
+        </w:rPr>
+        <w:t xml:space="preserve">Figure 12.</w:t>
+      </w:r>
+      <w:r>
+        <w:rPr/>
+        <w:t xml:space="preserve"> The live database: all six tables, with passwords, session tokens and codes stored only as hashes.</w:t>
+      </w:r>
+    </w:p>
+    <w:p>
+      <w:pPr>
+        <w:jc w:val="center"/>
+        <w:spacing w:lineRule="auto"/>
+      </w:pPr>
+      <w:r>
+        <w:rPr/>
+        <w:drawing>
+          <wp:inline distB="0" distL="0" distR="0" distT="0">
+            <wp:extent cx="5972810" cy="3817820"/>
+            <wp:effectExtent b="0" l="0" r="0" t="0"/>
+            <wp:docPr id="12" name="image-au4KYQoMy9HbSPPlV53I4.png"/>
+            <a:graphic>
+              <a:graphicData uri="http://schemas.openxmlformats.org/drawingml/2006/picture">
+                <pic:pic>
+                  <pic:nvPicPr>
+                    <pic:cNvPr id="12" name="image-au4KYQoMy9HbSPPlV53I4.png" descr=""/>
+                    <pic:cNvPicPr/>
+                  </pic:nvPicPr>
+                  <pic:blipFill>
+                    <a:blip r:embed="rId18" cstate="print"/>
+                    <a:srcRect b="0" l="0" r="0" t="0"/>
+                    <a:stretch>
+                      <a:fillRect/>
+                    </a:stretch>
+                  </pic:blipFill>
+                  <pic:spPr>
+                    <a:xfrm>
+                      <a:off x="0" y="0"/>
+                      <a:ext cx="5972810" cy="3817820"/>
+                    </a:xfrm>
+                    <a:prstGeom prst="rect"/>
+                  </pic:spPr>
+                </pic:pic>
+              </a:graphicData>
+            </a:graphic>
+          </wp:inline>
+        </w:drawing>
+      </w:r>
+    </w:p>
+    <w:p>
+      <w:pPr>
+        <w:spacing w:lineRule="auto"/>
+      </w:pPr>
+      <w:r>
+        <w:rPr>
+          <w:b/>
+        </w:rPr>
+        <w:t xml:space="preserve">Figure 13.</w:t>
+      </w:r>
+      <w:r>
+        <w:rPr/>
+        <w:t xml:space="preserve"> An account marked as deleted: it stays in the list (struck through) and can be restored.</w:t>
+      </w:r>
+    </w:p>
+    <w:p>
+      <w:pPr>
+        <w:jc w:val="center"/>
+        <w:spacing w:lineRule="auto"/>
+      </w:pPr>
+      <w:r>
+        <w:rPr/>
+        <w:drawing>
+          <wp:inline distB="0" distL="0" distR="0" distT="0">
+            <wp:extent cx="5972810" cy="3733006"/>
+            <wp:effectExtent b="0" l="0" r="0" t="0"/>
+            <wp:docPr id="13" name="image-0POvGqA5Vt_X17GkcQliB.png"/>
+            <a:graphic>
+              <a:graphicData uri="http://schemas.openxmlformats.org/drawingml/2006/picture">
+                <pic:pic>
+                  <pic:nvPicPr>
+                    <pic:cNvPr id="13" name="image-0POvGqA5Vt_X17GkcQliB.png" descr=""/>
+                    <pic:cNvPicPr/>
+                  </pic:nvPicPr>
+                  <pic:blipFill>
+                    <a:blip r:embed="rId19" cstate="print"/>
+                    <a:srcRect b="0" l="0" r="0" t="0"/>
+                    <a:stretch>
+                      <a:fillRect/>
+                    </a:stretch>
+                  </pic:blipFill>
+                  <pic:spPr>
+                    <a:xfrm>
+                      <a:off x="0" y="0"/>
+                      <a:ext cx="5972810" cy="3733006"/>
+                    </a:xfrm>
+                    <a:prstGeom prst="rect"/>
+                  </pic:spPr>
+                </pic:pic>
+              </a:graphicData>
+            </a:graphic>
+          </wp:inline>
+        </w:drawing>
+      </w:r>
+    </w:p>
+    <w:p>
+      <w:pPr>
+        <w:spacing w:lineRule="auto"/>
+      </w:pPr>
+      <w:r>
+        <w:rPr>
+          <w:b/>
+        </w:rPr>
+        <w:t xml:space="preserve">Figure 14.</w:t>
+      </w:r>
+      <w:r>
+        <w:rPr/>
+        <w:t xml:space="preserve"> Backup page: full database backup (download) and restore points (configuration only).</w:t>
+      </w:r>
+    </w:p>
+    <w:p>
+      <w:pPr>
+        <w:jc w:val="center"/>
+        <w:spacing w:lineRule="auto"/>
+      </w:pPr>
+      <w:r>
+        <w:rPr/>
+        <w:drawing>
+          <wp:inline distB="0" distL="0" distR="0" distT="0">
+            <wp:extent cx="5972810" cy="3733006"/>
+            <wp:effectExtent b="0" l="0" r="0" t="0"/>
+            <wp:docPr id="14" name="image-tYmU2YCYEXW4cp7VRSRNF.png"/>
+            <a:graphic>
+              <a:graphicData uri="http://schemas.openxmlformats.org/drawingml/2006/picture">
+                <pic:pic>
+                  <pic:nvPicPr>
+                    <pic:cNvPr id="14" name="image-tYmU2YCYEXW4cp7VRSRNF.png" descr=""/>
+                    <pic:cNvPicPr/>
+                  </pic:nvPicPr>
+                  <pic:blipFill>
+                    <a:blip r:embed="rId20" cstate="print"/>
+                    <a:srcRect b="0" l="0" r="0" t="0"/>
+                    <a:stretch>
+                      <a:fillRect/>
+                    </a:stretch>
+                  </pic:blipFill>
+                  <pic:spPr>
+                    <a:xfrm>
+                      <a:off x="0" y="0"/>
+                      <a:ext cx="5972810" cy="3733006"/>
+                    </a:xfrm>
+                    <a:prstGeom prst="rect"/>
+                  </pic:spPr>
+                </pic:pic>
+              </a:graphicData>
+            </a:graphic>
+          </wp:inline>
+        </w:drawing>
+      </w:r>
+    </w:p>
+    <w:p>
+      <w:pPr>
+        <w:spacing w:lineRule="auto"/>
+      </w:pPr>
+      <w:r>
+        <w:rPr>
+          <w:b/>
+        </w:rPr>
+        <w:t xml:space="preserve">Figure 15.</w:t>
+      </w:r>
+      <w:r>
+        <w:rPr/>
+        <w:t xml:space="preserve"> Reports page: accounts and successful logins per day.</w:t>
+      </w:r>
+    </w:p>
+    <w:p>
+      <w:pPr>
+        <w:jc w:val="center"/>
+        <w:spacing w:lineRule="auto"/>
+      </w:pPr>
+      <w:r>
+        <w:rPr/>
+        <w:drawing>
+          <wp:inline distB="0" distL="0" distR="0" distT="0">
+            <wp:extent cx="5972810" cy="3733006"/>
+            <wp:effectExtent b="0" l="0" r="0" t="0"/>
+            <wp:docPr id="15" name="image-A8AqPMui0UasWK6ph921i.png"/>
+            <a:graphic>
+              <a:graphicData uri="http://schemas.openxmlformats.org/drawingml/2006/picture">
+                <pic:pic>
+                  <pic:nvPicPr>
+                    <pic:cNvPr id="15" name="image-A8AqPMui0UasWK6ph921i.png" descr=""/>
+                    <pic:cNvPicPr/>
+                  </pic:nvPicPr>
+                  <pic:blipFill>
+                    <a:blip r:embed="rId21" cstate="print"/>
+                    <a:srcRect b="0" l="0" r="0" t="0"/>
+                    <a:stretch>
+                      <a:fillRect/>
+                    </a:stretch>
+                  </pic:blipFill>
+                  <pic:spPr>
+                    <a:xfrm>
+                      <a:off x="0" y="0"/>
+                      <a:ext cx="5972810" cy="3733006"/>
+                    </a:xfrm>
+                    <a:prstGeom prst="rect"/>
+                  </pic:spPr>
+                </pic:pic>
+              </a:graphicData>
+            </a:graphic>
+          </wp:inline>
+        </w:drawing>
+      </w:r>
+    </w:p>
+    <w:p>
+      <w:pPr>
+        <w:spacing w:lineRule="auto"/>
+      </w:pPr>
+      <w:r>
+        <w:rPr>
+          <w:b/>
+        </w:rPr>
+        <w:t xml:space="preserve">Figure 16.</w:t>
+      </w:r>
+      <w:r>
+        <w:rPr/>
+        <w:t xml:space="preserve"> Password demo: the pepper step, two different salts and hashes for the same password.</w:t>
+      </w:r>
+    </w:p>
+    <w:p>
+      <w:pPr>
+        <w:jc w:val="center"/>
+        <w:spacing w:lineRule="auto"/>
+      </w:pPr>
+      <w:r>
+        <w:rPr/>
+        <w:drawing>
+          <wp:inline distB="0" distL="0" distR="0" distT="0">
+            <wp:extent cx="5972810" cy="3733006"/>
+            <wp:effectExtent b="0" l="0" r="0" t="0"/>
+            <wp:docPr id="16" name="image-2kmrtJdKZKP6MJFIxKjhz.png"/>
+            <a:graphic>
+              <a:graphicData uri="http://schemas.openxmlformats.org/drawingml/2006/picture">
+                <pic:pic>
+                  <pic:nvPicPr>
+                    <pic:cNvPr id="16" name="image-2kmrtJdKZKP6MJFIxKjhz.png" descr=""/>
+                    <pic:cNvPicPr/>
+                  </pic:nvPicPr>
+                  <pic:blipFill>
+                    <a:blip r:embed="rId22" cstate="print"/>
+                    <a:srcRect b="0" l="0" r="0" t="0"/>
+                    <a:stretch>
+                      <a:fillRect/>
+                    </a:stretch>
+                  </pic:blipFill>
+                  <pic:spPr>
+                    <a:xfrm>
+                      <a:off x="0" y="0"/>
+                      <a:ext cx="5972810" cy="3733006"/>
+                    </a:xfrm>
+                    <a:prstGeom prst="rect"/>
+                  </pic:spPr>
+                </pic:pic>
+              </a:graphicData>
+            </a:graphic>
+          </wp:inline>
+        </w:drawing>
+      </w:r>
+    </w:p>
+    <w:p>
+      <w:pPr>
+        <w:spacing w:lineRule="auto"/>
+      </w:pPr>
+      <w:r>
         <w:rPr/>
         <w:t xml:space="preserve">Still to add from a local XAMPP or Laragon run: the terminal output of </w:t>
       </w:r>
@@ -6066,7 +7161,7 @@
       </w:pPr>
       <w:r>
         <w:rPr/>
-        <w:t xml:space="preserve">13. Limitations and future improvements</w:t>
+        <w:t xml:space="preserve">15. Limitations and future improvements</w:t>
       </w:r>
     </w:p>
     <w:p>
@@ -6079,7 +7174,7 @@
       </w:pPr>
       <w:r>
         <w:rPr/>
-        <w:t xml:space="preserve">The backend tests were run with PHP in WebAssembly against SQLite, not yet against MySQL (section 12.1).</w:t>
+        <w:t xml:space="preserve">The backend tests were run with PHP in WebAssembly against SQLite, not yet against MySQL (section 14.1).</w:t>
       </w:r>
     </w:p>
     <w:p>
@@ -6092,7 +7187,7 @@
       </w:pPr>
       <w:r>
         <w:rPr/>
-        <w:t xml:space="preserve">Email delivery through SMTP is implemented but has not been tested against a live mail server.</w:t>
+        <w:t xml:space="preserve">The pepper is a single secret; rotating it would require a re-hash migration (for example storing a pepper version with each hash) or forced password resets.</w:t>
       </w:r>
     </w:p>
     <w:p>
@@ -6105,7 +7200,7 @@
       </w:pPr>
       <w:r>
         <w:rPr/>
-        <w:t xml:space="preserve">The pepper is a single secret; rotating it would require a re-hash migration (for example storing a pepper version with each hash) or forced password resets.</w:t>
+        <w:t xml:space="preserve">Account lockout is per email, so an attacker can temporarily lock a victim's login by sending wrong passwords. A CAPTCHA or progressive delays would reduce this.</w:t>
       </w:r>
     </w:p>
     <w:p>
@@ -6118,7 +7213,7 @@
       </w:pPr>
       <w:r>
         <w:rPr/>
-        <w:t xml:space="preserve">Account lockout is per email, so an attacker can temporarily lock a victim's login by sending wrong passwords. A CAPTCHA or progressive delays would reduce this.</w:t>
+        <w:t xml:space="preserve">Registration reveals whether an email is already registered (needed for a clear error message). Email verification would avoid this.</w:t>
       </w:r>
     </w:p>
     <w:p>
@@ -6131,7 +7226,7 @@
       </w:pPr>
       <w:r>
         <w:rPr/>
-        <w:t xml:space="preserve">Registration reveals whether an email is already registered (needed for a clear error message). Email verification would avoid this.</w:t>
+        <w:t xml:space="preserve">No password reset, email verification or "remember this device" feature; sessions are fixed-length.</w:t>
       </w:r>
     </w:p>
     <w:p>
@@ -6144,7 +7239,15 @@
       </w:pPr>
       <w:r>
         <w:rPr/>
-        <w:t xml:space="preserve">No password reset, email verification or "remember this device" feature; sessions are fixed-length.</w:t>
+        <w:t xml:space="preserve">Roles are changed only from the command line or the </w:t>
+      </w:r>
+      <w:r>
+        <w:rPr/>
+        <w:t xml:space="preserve">ADMIN_EMAILS</w:t>
+      </w:r>
+      <w:r>
+        <w:rPr/>
+        <w:t xml:space="preserve"> setting; there is no page for changing roles.</w:t>
       </w:r>
     </w:p>
     <w:p>
@@ -6157,7 +7260,15 @@
       </w:pPr>
       <w:r>
         <w:rPr/>
-        <w:t xml:space="preserve">Roles are changed only from the command line; there is no administrator interface for changing roles.</w:t>
+        <w:t xml:space="preserve">Restoring a full backup is done in phpMyAdmin or with the </w:t>
+      </w:r>
+      <w:r>
+        <w:rPr/>
+        <w:t xml:space="preserve">mysql</w:t>
+      </w:r>
+      <w:r>
+        <w:rPr/>
+        <w:t xml:space="preserve"> command, not from the app, and it replaces all data. Restore points cover only roles and deleted status.</w:t>
       </w:r>
     </w:p>
     <w:p>
@@ -6170,7 +7281,7 @@
       </w:pPr>
       <w:r>
         <w:rPr/>
-        <w:t xml:space="preserve">The second factor is an emailed code, which is only as secure as the mailbox. Authenticator apps (TOTP) or WebAuthn passkeys are stronger.</w:t>
+        <w:t xml:space="preserve">The event log keeps growing; old entries are not yet archived or deleted automatically.</w:t>
       </w:r>
     </w:p>
     <w:p>
@@ -6183,7 +7294,7 @@
       </w:pPr>
       <w:r>
         <w:rPr/>
-        <w:t xml:space="preserve">Rate limits are stored in MySQL and keyed by IP address, which can be inaccurate behind shared networks or proxies.</w:t>
+        <w:t xml:space="preserve">The second factor is an emailed code, which is only as secure as the mailbox. Authenticator apps (TOTP) or WebAuthn passkeys are stronger.</w:t>
       </w:r>
     </w:p>
     <w:p>
@@ -6196,6 +7307,19 @@
       </w:pPr>
       <w:r>
         <w:rPr/>
+        <w:t xml:space="preserve">Rate limits are stored in MySQL and keyed by IP address, which can be inaccurate behind shared networks or proxies.</w:t>
+      </w:r>
+    </w:p>
+    <w:p>
+      <w:pPr>
+        <w:numPr>
+          <w:ilvl w:val="0"/>
+          <w:numId w:val="11"/>
+        </w:numPr>
+        <w:spacing w:lineRule="auto"/>
+      </w:pPr>
+      <w:r>
+        <w:rPr/>
         <w:t xml:space="preserve">The online version depends on three free or trial services (Vercel, Aiven, Gmail). Gmail limits sending to about 500 emails a day, codes can land in spam folders, and the first request after a quiet period can be slow while Vercel starts the PHP function.</w:t>
       </w:r>
     </w:p>
@@ -6206,25 +7330,25 @@
       </w:pPr>
       <w:r>
         <w:rPr/>
-        <w:t xml:space="preserve">14. Conclusion</w:t>
-      </w:r>
-    </w:p>
-    <w:p>
-      <w:pPr>
-        <w:spacing w:lineRule="auto"/>
-      </w:pPr>
-      <w:r>
-        <w:rPr/>
-        <w:t xml:space="preserve">The project implements the four required elements: users are identified through validated registration and a password check; a second factor (a single-use, expiring, attempt-limited one-time code) is required before a session is created; authorization depends on a role that the server reads from the database on every protected request; and passwords are protected with a per-password salt plus a server-side pepper. Sessions are random, stored only as hashes, expire and can be revoked, and the web version avoids storing tokens where scripts can read them.</w:t>
-      </w:r>
-    </w:p>
-    <w:p>
-      <w:pPr>
-        <w:spacing w:lineRule="auto"/>
-      </w:pPr>
-      <w:r>
-        <w:rPr/>
-        <w:t xml:space="preserve">The interface was built, type-checked, unit-tested and compiled for the web. The backend's 63 tests pass, and the whole system was tested end to end over HTTP and in a browser with the real PHP code, using SQLite in place of MySQL. The online version was then tested against real MySQL with real emailed codes, and sign-in works there. The full test suite has still to be run against a local XAMPP or Laragon MySQL.</w:t>
+        <w:t xml:space="preserve">16. Conclusion</w:t>
+      </w:r>
+    </w:p>
+    <w:p>
+      <w:pPr>
+        <w:spacing w:lineRule="auto"/>
+      </w:pPr>
+      <w:r>
+        <w:rPr/>
+        <w:t xml:space="preserve">The project implements the four required elements: users are identified through validated registration and a password check; a second factor (a single-use, expiring, attempt-limited one-time code) is required before a session is created; authorization depends on a role that the server reads from the database on every protected request; and passwords are protected with a per-password salt plus a server-side pepper. Sessions are random, stored only as hashes, expire and can be revoked, and the web version avoids storing tokens where scripts can read them. Administrators can also mark accounts as deleted without losing their data, download a full database backup, save and apply restore points that change only the configuration, view reports built from a security event log, and demonstrate salting and peppering step by step.</w:t>
+      </w:r>
+    </w:p>
+    <w:p>
+      <w:pPr>
+        <w:spacing w:lineRule="auto"/>
+      </w:pPr>
+      <w:r>
+        <w:rPr/>
+        <w:t xml:space="preserve">The interface was built, type-checked, unit-tested and compiled for the web. The backend's 74 tests pass, and the whole system was tested end to end over HTTP and in a browser with the real PHP code, using SQLite in place of MySQL. The online version was then tested against real MySQL with real emailed codes, and sign-in works there. The full test suite has still to be run against a local XAMPP or Laragon MySQL.</w:t>
       </w:r>
     </w:p>
     <w:p>
@@ -6234,7 +7358,7 @@
       </w:pPr>
       <w:r>
         <w:rPr/>
-        <w:t xml:space="preserve">15. Instructions for running the application</w:t>
+        <w:t xml:space="preserve">17. Instructions for running the application</w:t>
       </w:r>
     </w:p>
     <w:p>
@@ -6262,7 +7386,7 @@
         <w:rPr>
           <w:rFonts w:ascii="Courier" w:hAnsi="Courier"/>
         </w:rPr>
-        <w:t xml:space="preserve"># 1. start MySQL in the XAMPP Control Panel cd backend copy .env.example .env          # then put the output of  php bin/generate-secret.php  after APP_PEPPER= php bin/setup-db.php php tests/run.php               # backend tests php -S localhost:8000 -t public public/index.php  # in a second terminal cd mobile npm install npm test npx expo start                  # press w for the browser </w:t>
+        <w:t xml:space="preserve"># 1. start MySQL in the XAMPP Control Panel cd backend copy .env.example .env          # then put the output of  php bin/generate-secret.php  after APP_PEPPER= php bin/setup-db.php            # new database; an older one is upgraded with database/migrations/002_*.sql php tests/run.php               # backend tests php -S localhost:8000 -t public public/index.php  # in a second terminal cd mobile npm install npm test npx expo start                  # press w for the browser </w:t>
       </w:r>
     </w:p>
     <w:p>
@@ -6281,7 +7405,7 @@
         <w:rPr/>
         <w:t xml:space="preserve">. The online version is at </w:t>
       </w:r>
-      <w:hyperlink r:id="rId18">
+      <w:hyperlink r:id="rId23">
         <w:r>
           <w:rPr>
             <w:rStyle w:val="Hyperlink"/>

</xml_diff>

<commit_message>
Add admin Database page showing every table as stored
Read-only view of all six tables with row counts and the newest 50 rows, linked from the admin menu and dashboard. Docs, report and tests updated.
</commit_message>
<xml_diff>
--- a/REPORT.docx
+++ b/REPORT.docx
@@ -5,7 +5,7 @@
     <w:sectPr>
       <w:pgSz w:w="12240" w:h="15840" w:orient="portrait"/>
       <w:pgMar w:top="1417" w:right="1417" w:bottom="1247" w:left="1417" w:header="undefined" w:footer="undefined" w:gutter="undefined"/>
-      <w:footerReference r:id="rId24" w:type="default"/>
+      <w:footerReference r:id="rId25" w:type="default"/>
     </w:sectPr>
     <w:p>
       <w:pPr>
@@ -306,7 +306,7 @@
       </w:pPr>
       <w:r>
         <w:rPr/>
-        <w:t xml:space="preserve">12. Reports and the password demonstration</w:t>
+        <w:t xml:space="preserve">12. Reports, the database view and the password demonstration</w:t>
       </w:r>
     </w:p>
     <w:p>
@@ -1406,7 +1406,7 @@
       </w:r>
       <w:r>
         <w:rPr/>
-        <w:t xml:space="preserve"> the administrator features (deleting accounts, backup, restore points, reports, password demo) and </w:t>
+        <w:t xml:space="preserve"> the administrator features (deleting accounts, backup, restore points, reports, database view, password demo) and </w:t>
       </w:r>
       <w:r>
         <w:rPr/>
@@ -3268,7 +3268,7 @@
       </w:r>
       <w:r>
         <w:rPr/>
-        <w:t xml:space="preserve"> and checks the role. The interface hides the administrator menu (Users, Backup, Reports, Password demo) from students, but that is only for usability: every admin endpoint (</w:t>
+        <w:t xml:space="preserve"> and checks the role. The interface hides the administrator menu (Users, Backup, Reports, Database, Password demo) from students, but that is only for usability: every admin endpoint (</w:t>
       </w:r>
       <w:r>
         <w:rPr/>
@@ -3754,7 +3754,7 @@
       </w:pPr>
       <w:r>
         <w:rPr/>
-        <w:t xml:space="preserve">12. Reports and the password demonstration</w:t>
+        <w:t xml:space="preserve">12. Reports, the database view and the password demonstration</w:t>
       </w:r>
     </w:p>
     <w:p>
@@ -3817,6 +3817,53 @@
       <w:r>
         <w:rPr/>
         <w:t xml:space="preserve"> is rejected. Nothing typed on this page is saved or logged.</w:t>
+      </w:r>
+    </w:p>
+    <w:p>
+      <w:pPr>
+        <w:spacing w:lineRule="auto"/>
+      </w:pPr>
+      <w:r>
+        <w:rPr>
+          <w:b/>
+        </w:rPr>
+        <w:t xml:space="preserve">Database view.</w:t>
+      </w:r>
+      <w:r>
+        <w:rPr/>
+        <w:t xml:space="preserve"> So that everything can be shown from the administrator portal, the Database page (administrators only) shows all six tables exactly as they are stored, with the number of rows in each and the newest 50 rows. It makes the security visible: the </w:t>
+      </w:r>
+      <w:r>
+        <w:rPr/>
+        <w:t xml:space="preserve">password_hash</w:t>
+      </w:r>
+      <w:r>
+        <w:rPr/>
+        <w:t xml:space="preserve"> column holds only Argon2id hashes (with the salt inside), the pepper appears nowhere, </w:t>
+      </w:r>
+      <w:r>
+        <w:rPr/>
+        <w:t xml:space="preserve">sessions</w:t>
+      </w:r>
+      <w:r>
+        <w:rPr/>
+        <w:t xml:space="preserve"> holds only SHA-256 hashes of tokens, </w:t>
+      </w:r>
+      <w:r>
+        <w:rPr/>
+        <w:t xml:space="preserve">otp_challenges</w:t>
+      </w:r>
+      <w:r>
+        <w:rPr/>
+        <w:t xml:space="preserve"> only HMACs of the codes, and a deleted account is simply a row with a </w:t>
+      </w:r>
+      <w:r>
+        <w:rPr/>
+        <w:t xml:space="preserve">deleted_at</w:t>
+      </w:r>
+      <w:r>
+        <w:rPr/>
+        <w:t xml:space="preserve"> time. The page is read-only; changes are made on the Users and Backup pages (Figure 17).</w:t>
       </w:r>
     </w:p>
     <w:p>
@@ -4026,7 +4073,7 @@
             </w:pPr>
             <w:r>
               <w:rPr/>
-              <w:t xml:space="preserve">Deleting accounts, backup, restore points, reports, password demo</w:t>
+              <w:t xml:space="preserve">Deleting accounts, backup, restore points, reports, database view, password demo</w:t>
             </w:r>
           </w:p>
         </w:tc>
@@ -4682,7 +4729,7 @@
       </w:pPr>
       <w:r>
         <w:rPr/>
-        <w:t xml:space="preserve">The interface is deliberately simple: a header bar with the application name and (when logged in) the menu links Dashboard, Profile and Logout, plus Users, Backup, Reports and Password demo for administrators, with the page content below it. Forms are a single column with a maximum width, so the same layout works on a phone and in a desktop browser. The admin user list is a plain table that scrolls sideways on narrow screens. Forms show a loading state on the button, field-level errors and readable messages.</w:t>
+        <w:t xml:space="preserve">The interface is deliberately simple: a header bar with the application name and (when logged in) the menu links Dashboard, Profile and Logout, plus Users, Backup, Reports, Database and Password demo for administrators, with the page content below it. Forms are a single column with a maximum width, so the same layout works on a phone and in a desktop browser. The admin user list is a plain table that scrolls sideways on narrow screens. Forms show a loading state on the button, field-level errors and readable messages.</w:t>
       </w:r>
     </w:p>
     <w:p>
@@ -4715,7 +4762,7 @@
       </w:r>
       <w:r>
         <w:rPr/>
-        <w:t xml:space="preserve"> contains 74 tests that call the API kernel directly against a separate test database (</w:t>
+        <w:t xml:space="preserve"> contains 75 tests that call the API kernel directly against a separate test database (</w:t>
       </w:r>
       <w:r>
         <w:rPr/>
@@ -5193,7 +5240,7 @@
             </w:pPr>
             <w:r>
               <w:rPr/>
-              <w:t xml:space="preserve">Every admin endpoint refuses students (403) and visitors (401); deleting marks the account, ends its sessions and blocks login; restoring; no self-delete; CSRF headers on cookie actions; restore points change only roles and deleted status; full backup contents; reports counts; password demo (different salts, pepper never shown, nothing saved)</w:t>
+              <w:t xml:space="preserve">Every admin endpoint refuses students (403) and visitors (401); deleting marks the account, ends its sessions and blocks login; restoring; no self-delete; CSRF headers on cookie actions; restore points change only roles and deleted status; full backup contents; reports counts; database view (all six tables, hashes only, no password or pepper); password demo (different salts, pepper never shown, nothing saved)</w:t>
             </w:r>
           </w:p>
         </w:tc>
@@ -5334,7 +5381,7 @@
         <w:rPr>
           <w:rFonts w:ascii="Courier" w:hAnsi="Courier"/>
         </w:rPr>
-        <w:t xml:space="preserve">74 passed, 0 failed (1066 assertions) </w:t>
+        <w:t xml:space="preserve">75 passed, 0 failed (1084 assertions) </w:t>
       </w:r>
     </w:p>
     <w:p>
@@ -5991,11 +6038,11 @@
         <w:rPr>
           <w:b/>
         </w:rPr>
-        <w:t xml:space="preserve">Browser test (72 passed, 0 failed):</w:t>
-      </w:r>
-      <w:r>
-        <w:rPr/>
-        <w:t xml:space="preserve"> the web build was opened in a headless Edge browser and driven through a script in three sessions (desktop student, phone-sized administrator, desktop administrator) against the real PHP API. Besides the login checks below, it deletes and restores an account on the Users page, downloads a full backup, saves and applies a restore point, opens the Reports page, runs the Password demo, and confirms that a student is refused (403) on the Users, Backup, Reports and Password demo pages.</w:t>
+        <w:t xml:space="preserve">Browser test (74 passed, 0 failed):</w:t>
+      </w:r>
+      <w:r>
+        <w:rPr/>
+        <w:t xml:space="preserve"> the web build was opened in a headless Edge browser and driven through a script in three sessions (desktop student, phone-sized administrator, desktop administrator) against the real PHP API. Besides the login checks below, it deletes and restores an account on the Users page, downloads a full backup, saves and applies a restore point, opens the Reports and Database pages, runs the Password demo, and confirms that a student is refused (403) on the Users, Backup, Reports, Database and Password demo pages.</w:t>
       </w:r>
     </w:p>
     <w:p>
@@ -6230,7 +6277,7 @@
       </w:pPr>
       <w:r>
         <w:rPr/>
-        <w:t xml:space="preserve">Figures 1–10 and 13–16 were captured from the web version of the app running against the real PHP API on the local computer (</w:t>
+        <w:t xml:space="preserve">Figures 1–10 and 13–17 were captured from the web version of the app running against the real PHP API on the local computer (</w:t>
       </w:r>
       <w:r>
         <w:rPr/>
@@ -6267,12 +6314,12 @@
           <wp:inline distB="0" distL="0" distR="0" distT="0">
             <wp:extent cx="5972810" cy="3733006"/>
             <wp:effectExtent b="0" l="0" r="0" t="0"/>
-            <wp:docPr id="1" name="image-N81V2oSUcZpK6d2iBas_R.png"/>
+            <wp:docPr id="1" name="image-HPCpXLeqYwp0Pk4y14_na.png"/>
             <a:graphic>
               <a:graphicData uri="http://schemas.openxmlformats.org/drawingml/2006/picture">
                 <pic:pic>
                   <pic:nvPicPr>
-                    <pic:cNvPr id="1" name="image-N81V2oSUcZpK6d2iBas_R.png" descr=""/>
+                    <pic:cNvPr id="1" name="image-HPCpXLeqYwp0Pk4y14_na.png" descr=""/>
                     <pic:cNvPicPr/>
                   </pic:nvPicPr>
                   <pic:blipFill>
@@ -6322,12 +6369,12 @@
           <wp:inline distB="0" distL="0" distR="0" distT="0">
             <wp:extent cx="5972810" cy="3733006"/>
             <wp:effectExtent b="0" l="0" r="0" t="0"/>
-            <wp:docPr id="2" name="image-SmUO5lIS9RLCSoxyg7r2V.png"/>
+            <wp:docPr id="2" name="image-yipCpux_VN8dS74j9EQIN.png"/>
             <a:graphic>
               <a:graphicData uri="http://schemas.openxmlformats.org/drawingml/2006/picture">
                 <pic:pic>
                   <pic:nvPicPr>
-                    <pic:cNvPr id="2" name="image-SmUO5lIS9RLCSoxyg7r2V.png" descr=""/>
+                    <pic:cNvPr id="2" name="image-yipCpux_VN8dS74j9EQIN.png" descr=""/>
                     <pic:cNvPicPr/>
                   </pic:nvPicPr>
                   <pic:blipFill>
@@ -6377,12 +6424,12 @@
           <wp:inline distB="0" distL="0" distR="0" distT="0">
             <wp:extent cx="5972810" cy="3733006"/>
             <wp:effectExtent b="0" l="0" r="0" t="0"/>
-            <wp:docPr id="3" name="image-R11r_AnRFfcgUeS3aLbRK.png"/>
+            <wp:docPr id="3" name="image-70eH2WW8ddLW1Yip6HEcb.png"/>
             <a:graphic>
               <a:graphicData uri="http://schemas.openxmlformats.org/drawingml/2006/picture">
                 <pic:pic>
                   <pic:nvPicPr>
-                    <pic:cNvPr id="3" name="image-R11r_AnRFfcgUeS3aLbRK.png" descr=""/>
+                    <pic:cNvPr id="3" name="image-70eH2WW8ddLW1Yip6HEcb.png" descr=""/>
                     <pic:cNvPicPr/>
                   </pic:nvPicPr>
                   <pic:blipFill>
@@ -6432,12 +6479,12 @@
           <wp:inline distB="0" distL="0" distR="0" distT="0">
             <wp:extent cx="5972810" cy="3733006"/>
             <wp:effectExtent b="0" l="0" r="0" t="0"/>
-            <wp:docPr id="4" name="image-ugEfkKixegxPVS4wvWJmj.png"/>
+            <wp:docPr id="4" name="image-0YwPVtvlvPvJP73IMszot.png"/>
             <a:graphic>
               <a:graphicData uri="http://schemas.openxmlformats.org/drawingml/2006/picture">
                 <pic:pic>
                   <pic:nvPicPr>
-                    <pic:cNvPr id="4" name="image-ugEfkKixegxPVS4wvWJmj.png" descr=""/>
+                    <pic:cNvPr id="4" name="image-0YwPVtvlvPvJP73IMszot.png" descr=""/>
                     <pic:cNvPicPr/>
                   </pic:nvPicPr>
                   <pic:blipFill>
@@ -6487,12 +6534,12 @@
           <wp:inline distB="0" distL="0" distR="0" distT="0">
             <wp:extent cx="5972810" cy="3733006"/>
             <wp:effectExtent b="0" l="0" r="0" t="0"/>
-            <wp:docPr id="5" name="image-2lCidSyeVkDn0aGWdZ5aN.png"/>
+            <wp:docPr id="5" name="image-smWjKkFP7noQawCQtw_8C.png"/>
             <a:graphic>
               <a:graphicData uri="http://schemas.openxmlformats.org/drawingml/2006/picture">
                 <pic:pic>
                   <pic:nvPicPr>
-                    <pic:cNvPr id="5" name="image-2lCidSyeVkDn0aGWdZ5aN.png" descr=""/>
+                    <pic:cNvPr id="5" name="image-smWjKkFP7noQawCQtw_8C.png" descr=""/>
                     <pic:cNvPicPr/>
                   </pic:nvPicPr>
                   <pic:blipFill>
@@ -6542,12 +6589,12 @@
           <wp:inline distB="0" distL="0" distR="0" distT="0">
             <wp:extent cx="5972810" cy="3733006"/>
             <wp:effectExtent b="0" l="0" r="0" t="0"/>
-            <wp:docPr id="6" name="image-xz7AKxLmWd8s8vvzvhhKI.png"/>
+            <wp:docPr id="6" name="image-gCBBLvx4kQJf_TyfS__Ui.png"/>
             <a:graphic>
               <a:graphicData uri="http://schemas.openxmlformats.org/drawingml/2006/picture">
                 <pic:pic>
                   <pic:nvPicPr>
-                    <pic:cNvPr id="6" name="image-xz7AKxLmWd8s8vvzvhhKI.png" descr=""/>
+                    <pic:cNvPr id="6" name="image-gCBBLvx4kQJf_TyfS__Ui.png" descr=""/>
                     <pic:cNvPicPr/>
                   </pic:nvPicPr>
                   <pic:blipFill>
@@ -6597,12 +6644,12 @@
           <wp:inline distB="0" distL="0" distR="0" distT="0">
             <wp:extent cx="5972810" cy="3733006"/>
             <wp:effectExtent b="0" l="0" r="0" t="0"/>
-            <wp:docPr id="7" name="image-9x5zMPQMiABi1mJHeCP03.png"/>
+            <wp:docPr id="7" name="image-xEeviFF-zIGywMMKuYxfs.png"/>
             <a:graphic>
               <a:graphicData uri="http://schemas.openxmlformats.org/drawingml/2006/picture">
                 <pic:pic>
                   <pic:nvPicPr>
-                    <pic:cNvPr id="7" name="image-9x5zMPQMiABi1mJHeCP03.png" descr=""/>
+                    <pic:cNvPr id="7" name="image-xEeviFF-zIGywMMKuYxfs.png" descr=""/>
                     <pic:cNvPicPr/>
                   </pic:nvPicPr>
                   <pic:blipFill>
@@ -6652,12 +6699,12 @@
           <wp:inline distB="0" distL="0" distR="0" distT="0">
             <wp:extent cx="5972810" cy="3733006"/>
             <wp:effectExtent b="0" l="0" r="0" t="0"/>
-            <wp:docPr id="8" name="image-0xd-_dRvH-vxmqL9aFeiT.png"/>
+            <wp:docPr id="8" name="image-hWObwVj_n3ltYtBYRE6ip.png"/>
             <a:graphic>
               <a:graphicData uri="http://schemas.openxmlformats.org/drawingml/2006/picture">
                 <pic:pic>
                   <pic:nvPicPr>
-                    <pic:cNvPr id="8" name="image-0xd-_dRvH-vxmqL9aFeiT.png" descr=""/>
+                    <pic:cNvPr id="8" name="image-hWObwVj_n3ltYtBYRE6ip.png" descr=""/>
                     <pic:cNvPicPr/>
                   </pic:nvPicPr>
                   <pic:blipFill>
@@ -6707,12 +6754,12 @@
           <wp:inline distB="0" distL="0" distR="0" distT="0">
             <wp:extent cx="5972810" cy="3733006"/>
             <wp:effectExtent b="0" l="0" r="0" t="0"/>
-            <wp:docPr id="9" name="image-25sh8UZ7Hy1BjrKYuwt7p.png"/>
+            <wp:docPr id="9" name="image-spiXBY_534zo7wUN2fZcL.png"/>
             <a:graphic>
               <a:graphicData uri="http://schemas.openxmlformats.org/drawingml/2006/picture">
                 <pic:pic>
                   <pic:nvPicPr>
-                    <pic:cNvPr id="9" name="image-25sh8UZ7Hy1BjrKYuwt7p.png" descr=""/>
+                    <pic:cNvPr id="9" name="image-spiXBY_534zo7wUN2fZcL.png" descr=""/>
                     <pic:cNvPicPr/>
                   </pic:nvPicPr>
                   <pic:blipFill>
@@ -6762,12 +6809,12 @@
           <wp:inline distB="0" distL="0" distR="0" distT="0">
             <wp:extent cx="5972810" cy="12925773"/>
             <wp:effectExtent b="0" l="0" r="0" t="0"/>
-            <wp:docPr id="10" name="image-QZU2W6DGIzn7L963G8IAV.png"/>
+            <wp:docPr id="10" name="image--_427lwariBy2WPvc3GYk.png"/>
             <a:graphic>
               <a:graphicData uri="http://schemas.openxmlformats.org/drawingml/2006/picture">
                 <pic:pic>
                   <pic:nvPicPr>
-                    <pic:cNvPr id="10" name="image-QZU2W6DGIzn7L963G8IAV.png" descr=""/>
+                    <pic:cNvPr id="10" name="image--_427lwariBy2WPvc3GYk.png" descr=""/>
                     <pic:cNvPicPr/>
                   </pic:nvPicPr>
                   <pic:blipFill>
@@ -6833,12 +6880,12 @@
           <wp:inline distB="0" distL="0" distR="0" distT="0">
             <wp:extent cx="5972810" cy="1518511"/>
             <wp:effectExtent b="0" l="0" r="0" t="0"/>
-            <wp:docPr id="11" name="image-JMMY_uFSvsPAQXmmRuAYj.png"/>
+            <wp:docPr id="11" name="image-g_Fze5wlGq3TSXKk33Qsv.png"/>
             <a:graphic>
               <a:graphicData uri="http://schemas.openxmlformats.org/drawingml/2006/picture">
                 <pic:pic>
                   <pic:nvPicPr>
-                    <pic:cNvPr id="11" name="image-JMMY_uFSvsPAQXmmRuAYj.png" descr=""/>
+                    <pic:cNvPr id="11" name="image-g_Fze5wlGq3TSXKk33Qsv.png" descr=""/>
                     <pic:cNvPicPr/>
                   </pic:nvPicPr>
                   <pic:blipFill>
@@ -6888,12 +6935,12 @@
           <wp:inline distB="0" distL="0" distR="0" distT="0">
             <wp:extent cx="5972810" cy="3817820"/>
             <wp:effectExtent b="0" l="0" r="0" t="0"/>
-            <wp:docPr id="12" name="image-au4KYQoMy9HbSPPlV53I4.png"/>
+            <wp:docPr id="12" name="image-ETXEUFoBaYg0ACkJiYjBL.png"/>
             <a:graphic>
               <a:graphicData uri="http://schemas.openxmlformats.org/drawingml/2006/picture">
                 <pic:pic>
                   <pic:nvPicPr>
-                    <pic:cNvPr id="12" name="image-au4KYQoMy9HbSPPlV53I4.png" descr=""/>
+                    <pic:cNvPr id="12" name="image-ETXEUFoBaYg0ACkJiYjBL.png" descr=""/>
                     <pic:cNvPicPr/>
                   </pic:nvPicPr>
                   <pic:blipFill>
@@ -6943,12 +6990,12 @@
           <wp:inline distB="0" distL="0" distR="0" distT="0">
             <wp:extent cx="5972810" cy="3733006"/>
             <wp:effectExtent b="0" l="0" r="0" t="0"/>
-            <wp:docPr id="13" name="image-0POvGqA5Vt_X17GkcQliB.png"/>
+            <wp:docPr id="13" name="image-nCsHK_1zHJhw3WtiUlr6k.png"/>
             <a:graphic>
               <a:graphicData uri="http://schemas.openxmlformats.org/drawingml/2006/picture">
                 <pic:pic>
                   <pic:nvPicPr>
-                    <pic:cNvPr id="13" name="image-0POvGqA5Vt_X17GkcQliB.png" descr=""/>
+                    <pic:cNvPr id="13" name="image-nCsHK_1zHJhw3WtiUlr6k.png" descr=""/>
                     <pic:cNvPicPr/>
                   </pic:nvPicPr>
                   <pic:blipFill>
@@ -6998,12 +7045,12 @@
           <wp:inline distB="0" distL="0" distR="0" distT="0">
             <wp:extent cx="5972810" cy="3733006"/>
             <wp:effectExtent b="0" l="0" r="0" t="0"/>
-            <wp:docPr id="14" name="image-tYmU2YCYEXW4cp7VRSRNF.png"/>
+            <wp:docPr id="14" name="image-lnr6jJ3HPIHbaFRsu7mzc.png"/>
             <a:graphic>
               <a:graphicData uri="http://schemas.openxmlformats.org/drawingml/2006/picture">
                 <pic:pic>
                   <pic:nvPicPr>
-                    <pic:cNvPr id="14" name="image-tYmU2YCYEXW4cp7VRSRNF.png" descr=""/>
+                    <pic:cNvPr id="14" name="image-lnr6jJ3HPIHbaFRsu7mzc.png" descr=""/>
                     <pic:cNvPicPr/>
                   </pic:nvPicPr>
                   <pic:blipFill>
@@ -7053,12 +7100,12 @@
           <wp:inline distB="0" distL="0" distR="0" distT="0">
             <wp:extent cx="5972810" cy="3733006"/>
             <wp:effectExtent b="0" l="0" r="0" t="0"/>
-            <wp:docPr id="15" name="image-A8AqPMui0UasWK6ph921i.png"/>
+            <wp:docPr id="15" name="image-KhtO8ejMRdJRKOJPEVyVF.png"/>
             <a:graphic>
               <a:graphicData uri="http://schemas.openxmlformats.org/drawingml/2006/picture">
                 <pic:pic>
                   <pic:nvPicPr>
-                    <pic:cNvPr id="15" name="image-A8AqPMui0UasWK6ph921i.png" descr=""/>
+                    <pic:cNvPr id="15" name="image-KhtO8ejMRdJRKOJPEVyVF.png" descr=""/>
                     <pic:cNvPicPr/>
                   </pic:nvPicPr>
                   <pic:blipFill>
@@ -7108,12 +7155,12 @@
           <wp:inline distB="0" distL="0" distR="0" distT="0">
             <wp:extent cx="5972810" cy="3733006"/>
             <wp:effectExtent b="0" l="0" r="0" t="0"/>
-            <wp:docPr id="16" name="image-2kmrtJdKZKP6MJFIxKjhz.png"/>
+            <wp:docPr id="16" name="image-OTkaOUiHb4xu-OD5OFXMY.png"/>
             <a:graphic>
               <a:graphicData uri="http://schemas.openxmlformats.org/drawingml/2006/picture">
                 <pic:pic>
                   <pic:nvPicPr>
-                    <pic:cNvPr id="16" name="image-2kmrtJdKZKP6MJFIxKjhz.png" descr=""/>
+                    <pic:cNvPr id="16" name="image-OTkaOUiHb4xu-OD5OFXMY.png" descr=""/>
                     <pic:cNvPicPr/>
                   </pic:nvPicPr>
                   <pic:blipFill>
@@ -7142,6 +7189,61 @@
         <w:spacing w:lineRule="auto"/>
       </w:pPr>
       <w:r>
+        <w:rPr>
+          <w:b/>
+        </w:rPr>
+        <w:t xml:space="preserve">Figure 17.</w:t>
+      </w:r>
+      <w:r>
+        <w:rPr/>
+        <w:t xml:space="preserve"> Database page: every table as stored; passwords appear only as hashes.</w:t>
+      </w:r>
+    </w:p>
+    <w:p>
+      <w:pPr>
+        <w:jc w:val="center"/>
+        <w:spacing w:lineRule="auto"/>
+      </w:pPr>
+      <w:r>
+        <w:rPr/>
+        <w:drawing>
+          <wp:inline distB="0" distL="0" distR="0" distT="0">
+            <wp:extent cx="5972810" cy="3733006"/>
+            <wp:effectExtent b="0" l="0" r="0" t="0"/>
+            <wp:docPr id="17" name="image-n7Oanz_6FWFCdOOZyLIp4.png"/>
+            <a:graphic>
+              <a:graphicData uri="http://schemas.openxmlformats.org/drawingml/2006/picture">
+                <pic:pic>
+                  <pic:nvPicPr>
+                    <pic:cNvPr id="17" name="image-n7Oanz_6FWFCdOOZyLIp4.png" descr=""/>
+                    <pic:cNvPicPr/>
+                  </pic:nvPicPr>
+                  <pic:blipFill>
+                    <a:blip r:embed="rId23" cstate="print"/>
+                    <a:srcRect b="0" l="0" r="0" t="0"/>
+                    <a:stretch>
+                      <a:fillRect/>
+                    </a:stretch>
+                  </pic:blipFill>
+                  <pic:spPr>
+                    <a:xfrm>
+                      <a:off x="0" y="0"/>
+                      <a:ext cx="5972810" cy="3733006"/>
+                    </a:xfrm>
+                    <a:prstGeom prst="rect"/>
+                  </pic:spPr>
+                </pic:pic>
+              </a:graphicData>
+            </a:graphic>
+          </wp:inline>
+        </w:drawing>
+      </w:r>
+    </w:p>
+    <w:p>
+      <w:pPr>
+        <w:spacing w:lineRule="auto"/>
+      </w:pPr>
+      <w:r>
         <w:rPr/>
         <w:t xml:space="preserve">Still to add from a local XAMPP or Laragon run: the terminal output of </w:t>
       </w:r>
@@ -7339,16 +7441,16 @@
       </w:pPr>
       <w:r>
         <w:rPr/>
-        <w:t xml:space="preserve">The project implements the four required elements: users are identified through validated registration and a password check; a second factor (a single-use, expiring, attempt-limited one-time code) is required before a session is created; authorization depends on a role that the server reads from the database on every protected request; and passwords are protected with a per-password salt plus a server-side pepper. Sessions are random, stored only as hashes, expire and can be revoked, and the web version avoids storing tokens where scripts can read them. Administrators can also mark accounts as deleted without losing their data, download a full database backup, save and apply restore points that change only the configuration, view reports built from a security event log, and demonstrate salting and peppering step by step.</w:t>
-      </w:r>
-    </w:p>
-    <w:p>
-      <w:pPr>
-        <w:spacing w:lineRule="auto"/>
-      </w:pPr>
-      <w:r>
-        <w:rPr/>
-        <w:t xml:space="preserve">The interface was built, type-checked, unit-tested and compiled for the web. The backend's 74 tests pass, and the whole system was tested end to end over HTTP and in a browser with the real PHP code, using SQLite in place of MySQL. The online version was then tested against real MySQL with real emailed codes, and sign-in works there. The full test suite has still to be run against a local XAMPP or Laragon MySQL.</w:t>
+        <w:t xml:space="preserve">The project implements the four required elements: users are identified through validated registration and a password check; a second factor (a single-use, expiring, attempt-limited one-time code) is required before a session is created; authorization depends on a role that the server reads from the database on every protected request; and passwords are protected with a per-password salt plus a server-side pepper. Sessions are random, stored only as hashes, expire and can be revoked, and the web version avoids storing tokens where scripts can read them. Administrators can also mark accounts as deleted without losing their data, download a full database backup, save and apply restore points that change only the configuration, view reports built from a security event log, view every database table as stored, and demonstrate salting and peppering step by step.</w:t>
+      </w:r>
+    </w:p>
+    <w:p>
+      <w:pPr>
+        <w:spacing w:lineRule="auto"/>
+      </w:pPr>
+      <w:r>
+        <w:rPr/>
+        <w:t xml:space="preserve">The interface was built, type-checked, unit-tested and compiled for the web. The backend's 75 tests pass, and the whole system was tested end to end over HTTP and in a browser with the real PHP code, using SQLite in place of MySQL. The online version was then tested against real MySQL with real emailed codes, and sign-in works there. The full test suite has still to be run against a local XAMPP or Laragon MySQL.</w:t>
       </w:r>
     </w:p>
     <w:p>
@@ -7405,7 +7507,7 @@
         <w:rPr/>
         <w:t xml:space="preserve">. The online version is at </w:t>
       </w:r>
-      <w:hyperlink r:id="rId23">
+      <w:hyperlink r:id="rId24">
         <w:r>
           <w:rPr>
             <w:rStyle w:val="Hyperlink"/>

</xml_diff>

<commit_message>
Require 16-character passwords, show full stored hash to admins
Users page shows each account's password hash exactly as stored; the read-only note is removed from the Database page. Tests, docs and report updated.
</commit_message>
<xml_diff>
--- a/REPORT.docx
+++ b/REPORT.docx
@@ -2728,7 +2728,7 @@
       </w:r>
       <w:r>
         <w:rPr/>
-        <w:t xml:space="preserve">). The client validates the form first (name length, email format, password rules, matching confirmation) to give instant feedback. The server then validates the same rules again, because client checks can be bypassed. The password must be 12 to 128 characters long, contain at least one letter and one digit, must not be a very common password, and must not equal the email address. The email is converted to lower case; if an account with that email already exists the server answers </w:t>
+        <w:t xml:space="preserve">). The client validates the form first (name length, email format, password rules, matching confirmation) to give instant feedback. The server then validates the same rules again, because client checks can be bypassed. The password must be 16 to 128 characters long, contain at least one letter and one digit, must not be a very common password, and must not equal the email address. The email is converted to lower case; if an account with that email already exists the server answers </w:t>
       </w:r>
       <w:r>
         <w:rPr/>
@@ -5085,7 +5085,7 @@
             </w:pPr>
             <w:r>
               <w:rPr/>
-              <w:t xml:space="preserve">Admin can list users; normal user gets 403; anonymous gets 401; role comes from the database; no hashes in output</w:t>
+              <w:t xml:space="preserve">Admin can list users; normal user gets 403; anonymous gets 401; role comes from the database; the full stored hash is shown, never the password</w:t>
             </w:r>
           </w:p>
         </w:tc>
@@ -6023,7 +6023,7 @@
       </w:r>
       <w:r>
         <w:rPr/>
-        <w:t xml:space="preserve">, the admin user list without password hashes, and cookie logout refused without the CSRF headers.</w:t>
+        <w:t xml:space="preserve">, the admin user list, and cookie logout refused without the CSRF headers.</w:t>
       </w:r>
     </w:p>
     <w:p>
@@ -6038,7 +6038,7 @@
         <w:rPr>
           <w:b/>
         </w:rPr>
-        <w:t xml:space="preserve">Browser test (74 passed, 0 failed):</w:t>
+        <w:t xml:space="preserve">Browser test (76 passed, 0 failed):</w:t>
       </w:r>
       <w:r>
         <w:rPr/>
@@ -6229,7 +6229,7 @@
       </w:r>
       <w:r>
         <w:rPr/>
-        <w:t xml:space="preserve"> was applied to the live database and the new version was deployed. The 17 live checks passed again. A temporary administrator account was then used for 12 more live checks, all passed: the emailed code was accepted; the user list showed the Argon2id preview; a restore point was saved; a test account was deleted and could no longer log in; applying the restore point brought it back (configuration only); a full backup was downloaded; the reports counted these actions; the password demo used Argon2id, gave two different salts and refused the password without the pepper; and the restored account could log in again. Finally the backup file was </w:t>
+        <w:t xml:space="preserve"> was applied to the live database and the new version was deployed. The 17 live checks passed again. A temporary administrator account was then used for 12 more live checks, all passed: the emailed code was accepted; the user list showed the Argon2id hashes; a restore point was saved; a test account was deleted and could no longer log in; applying the restore point brought it back (configuration only); a full backup was downloaded; the reports counted these actions; the password demo used Argon2id, gave two different salts and refused the password without the pepper; and the restored account could log in again. Finally the backup file was </w:t>
       </w:r>
       <w:r>
         <w:rPr>
@@ -6314,12 +6314,12 @@
           <wp:inline distB="0" distL="0" distR="0" distT="0">
             <wp:extent cx="5972810" cy="3733006"/>
             <wp:effectExtent b="0" l="0" r="0" t="0"/>
-            <wp:docPr id="1" name="image-HPCpXLeqYwp0Pk4y14_na.png"/>
+            <wp:docPr id="1" name="image-6bgUmwRN_MrHjJ0lRfhb4.png"/>
             <a:graphic>
               <a:graphicData uri="http://schemas.openxmlformats.org/drawingml/2006/picture">
                 <pic:pic>
                   <pic:nvPicPr>
-                    <pic:cNvPr id="1" name="image-HPCpXLeqYwp0Pk4y14_na.png" descr=""/>
+                    <pic:cNvPr id="1" name="image-6bgUmwRN_MrHjJ0lRfhb4.png" descr=""/>
                     <pic:cNvPicPr/>
                   </pic:nvPicPr>
                   <pic:blipFill>
@@ -6369,12 +6369,12 @@
           <wp:inline distB="0" distL="0" distR="0" distT="0">
             <wp:extent cx="5972810" cy="3733006"/>
             <wp:effectExtent b="0" l="0" r="0" t="0"/>
-            <wp:docPr id="2" name="image-yipCpux_VN8dS74j9EQIN.png"/>
+            <wp:docPr id="2" name="image-piX8ORUwMbmMqkUcJtZc5.png"/>
             <a:graphic>
               <a:graphicData uri="http://schemas.openxmlformats.org/drawingml/2006/picture">
                 <pic:pic>
                   <pic:nvPicPr>
-                    <pic:cNvPr id="2" name="image-yipCpux_VN8dS74j9EQIN.png" descr=""/>
+                    <pic:cNvPr id="2" name="image-piX8ORUwMbmMqkUcJtZc5.png" descr=""/>
                     <pic:cNvPicPr/>
                   </pic:nvPicPr>
                   <pic:blipFill>
@@ -6424,12 +6424,12 @@
           <wp:inline distB="0" distL="0" distR="0" distT="0">
             <wp:extent cx="5972810" cy="3733006"/>
             <wp:effectExtent b="0" l="0" r="0" t="0"/>
-            <wp:docPr id="3" name="image-70eH2WW8ddLW1Yip6HEcb.png"/>
+            <wp:docPr id="3" name="image-zYkbSOIDZHDZn7NH13ujF.png"/>
             <a:graphic>
               <a:graphicData uri="http://schemas.openxmlformats.org/drawingml/2006/picture">
                 <pic:pic>
                   <pic:nvPicPr>
-                    <pic:cNvPr id="3" name="image-70eH2WW8ddLW1Yip6HEcb.png" descr=""/>
+                    <pic:cNvPr id="3" name="image-zYkbSOIDZHDZn7NH13ujF.png" descr=""/>
                     <pic:cNvPicPr/>
                   </pic:nvPicPr>
                   <pic:blipFill>
@@ -6479,12 +6479,12 @@
           <wp:inline distB="0" distL="0" distR="0" distT="0">
             <wp:extent cx="5972810" cy="3733006"/>
             <wp:effectExtent b="0" l="0" r="0" t="0"/>
-            <wp:docPr id="4" name="image-0YwPVtvlvPvJP73IMszot.png"/>
+            <wp:docPr id="4" name="image-Gg08ud6f52ZR1zzluGfYC.png"/>
             <a:graphic>
               <a:graphicData uri="http://schemas.openxmlformats.org/drawingml/2006/picture">
                 <pic:pic>
                   <pic:nvPicPr>
-                    <pic:cNvPr id="4" name="image-0YwPVtvlvPvJP73IMszot.png" descr=""/>
+                    <pic:cNvPr id="4" name="image-Gg08ud6f52ZR1zzluGfYC.png" descr=""/>
                     <pic:cNvPicPr/>
                   </pic:nvPicPr>
                   <pic:blipFill>
@@ -6534,12 +6534,12 @@
           <wp:inline distB="0" distL="0" distR="0" distT="0">
             <wp:extent cx="5972810" cy="3733006"/>
             <wp:effectExtent b="0" l="0" r="0" t="0"/>
-            <wp:docPr id="5" name="image-smWjKkFP7noQawCQtw_8C.png"/>
+            <wp:docPr id="5" name="image-NO0_eWBoiEuQ27mFwiUKt.png"/>
             <a:graphic>
               <a:graphicData uri="http://schemas.openxmlformats.org/drawingml/2006/picture">
                 <pic:pic>
                   <pic:nvPicPr>
-                    <pic:cNvPr id="5" name="image-smWjKkFP7noQawCQtw_8C.png" descr=""/>
+                    <pic:cNvPr id="5" name="image-NO0_eWBoiEuQ27mFwiUKt.png" descr=""/>
                     <pic:cNvPicPr/>
                   </pic:nvPicPr>
                   <pic:blipFill>
@@ -6589,12 +6589,12 @@
           <wp:inline distB="0" distL="0" distR="0" distT="0">
             <wp:extent cx="5972810" cy="3733006"/>
             <wp:effectExtent b="0" l="0" r="0" t="0"/>
-            <wp:docPr id="6" name="image-gCBBLvx4kQJf_TyfS__Ui.png"/>
+            <wp:docPr id="6" name="image-RrO7phILkpApWW9QRatyJ.png"/>
             <a:graphic>
               <a:graphicData uri="http://schemas.openxmlformats.org/drawingml/2006/picture">
                 <pic:pic>
                   <pic:nvPicPr>
-                    <pic:cNvPr id="6" name="image-gCBBLvx4kQJf_TyfS__Ui.png" descr=""/>
+                    <pic:cNvPr id="6" name="image-RrO7phILkpApWW9QRatyJ.png" descr=""/>
                     <pic:cNvPicPr/>
                   </pic:nvPicPr>
                   <pic:blipFill>
@@ -6644,12 +6644,12 @@
           <wp:inline distB="0" distL="0" distR="0" distT="0">
             <wp:extent cx="5972810" cy="3733006"/>
             <wp:effectExtent b="0" l="0" r="0" t="0"/>
-            <wp:docPr id="7" name="image-xEeviFF-zIGywMMKuYxfs.png"/>
+            <wp:docPr id="7" name="image-P9x2KYoD7vqB8t9fy90fS.png"/>
             <a:graphic>
               <a:graphicData uri="http://schemas.openxmlformats.org/drawingml/2006/picture">
                 <pic:pic>
                   <pic:nvPicPr>
-                    <pic:cNvPr id="7" name="image-xEeviFF-zIGywMMKuYxfs.png" descr=""/>
+                    <pic:cNvPr id="7" name="image-P9x2KYoD7vqB8t9fy90fS.png" descr=""/>
                     <pic:cNvPicPr/>
                   </pic:nvPicPr>
                   <pic:blipFill>
@@ -6699,12 +6699,12 @@
           <wp:inline distB="0" distL="0" distR="0" distT="0">
             <wp:extent cx="5972810" cy="3733006"/>
             <wp:effectExtent b="0" l="0" r="0" t="0"/>
-            <wp:docPr id="8" name="image-hWObwVj_n3ltYtBYRE6ip.png"/>
+            <wp:docPr id="8" name="image-bfr1oQyeDRIOxXDt3_rI6.png"/>
             <a:graphic>
               <a:graphicData uri="http://schemas.openxmlformats.org/drawingml/2006/picture">
                 <pic:pic>
                   <pic:nvPicPr>
-                    <pic:cNvPr id="8" name="image-hWObwVj_n3ltYtBYRE6ip.png" descr=""/>
+                    <pic:cNvPr id="8" name="image-bfr1oQyeDRIOxXDt3_rI6.png" descr=""/>
                     <pic:cNvPicPr/>
                   </pic:nvPicPr>
                   <pic:blipFill>
@@ -6740,7 +6740,7 @@
       </w:r>
       <w:r>
         <w:rPr/>
-        <w:t xml:space="preserve"> The Users page for an administrator. Only a shortened preview of each stored hash is sent.</w:t>
+        <w:t xml:space="preserve"> The Users page for an administrator. Under each account is its password exactly as stored (the full hash); the password itself is never stored.</w:t>
       </w:r>
     </w:p>
     <w:p>
@@ -6754,12 +6754,12 @@
           <wp:inline distB="0" distL="0" distR="0" distT="0">
             <wp:extent cx="5972810" cy="3733006"/>
             <wp:effectExtent b="0" l="0" r="0" t="0"/>
-            <wp:docPr id="9" name="image-spiXBY_534zo7wUN2fZcL.png"/>
+            <wp:docPr id="9" name="image-_ieTNPWu_YeD_vLoek7UY.png"/>
             <a:graphic>
               <a:graphicData uri="http://schemas.openxmlformats.org/drawingml/2006/picture">
                 <pic:pic>
                   <pic:nvPicPr>
-                    <pic:cNvPr id="9" name="image-spiXBY_534zo7wUN2fZcL.png" descr=""/>
+                    <pic:cNvPr id="9" name="image-_ieTNPWu_YeD_vLoek7UY.png" descr=""/>
                     <pic:cNvPicPr/>
                   </pic:nvPicPr>
                   <pic:blipFill>
@@ -6809,12 +6809,12 @@
           <wp:inline distB="0" distL="0" distR="0" distT="0">
             <wp:extent cx="5972810" cy="12925773"/>
             <wp:effectExtent b="0" l="0" r="0" t="0"/>
-            <wp:docPr id="10" name="image--_427lwariBy2WPvc3GYk.png"/>
+            <wp:docPr id="10" name="image-hUp8zNnwWIfeilv8gUeHw.png"/>
             <a:graphic>
               <a:graphicData uri="http://schemas.openxmlformats.org/drawingml/2006/picture">
                 <pic:pic>
                   <pic:nvPicPr>
-                    <pic:cNvPr id="10" name="image--_427lwariBy2WPvc3GYk.png" descr=""/>
+                    <pic:cNvPr id="10" name="image-hUp8zNnwWIfeilv8gUeHw.png" descr=""/>
                     <pic:cNvPicPr/>
                   </pic:nvPicPr>
                   <pic:blipFill>
@@ -6880,12 +6880,12 @@
           <wp:inline distB="0" distL="0" distR="0" distT="0">
             <wp:extent cx="5972810" cy="1518511"/>
             <wp:effectExtent b="0" l="0" r="0" t="0"/>
-            <wp:docPr id="11" name="image-g_Fze5wlGq3TSXKk33Qsv.png"/>
+            <wp:docPr id="11" name="image-8yoSeoRiklfDM315rPTr7.png"/>
             <a:graphic>
               <a:graphicData uri="http://schemas.openxmlformats.org/drawingml/2006/picture">
                 <pic:pic>
                   <pic:nvPicPr>
-                    <pic:cNvPr id="11" name="image-g_Fze5wlGq3TSXKk33Qsv.png" descr=""/>
+                    <pic:cNvPr id="11" name="image-8yoSeoRiklfDM315rPTr7.png" descr=""/>
                     <pic:cNvPicPr/>
                   </pic:nvPicPr>
                   <pic:blipFill>
@@ -6935,12 +6935,12 @@
           <wp:inline distB="0" distL="0" distR="0" distT="0">
             <wp:extent cx="5972810" cy="3817820"/>
             <wp:effectExtent b="0" l="0" r="0" t="0"/>
-            <wp:docPr id="12" name="image-ETXEUFoBaYg0ACkJiYjBL.png"/>
+            <wp:docPr id="12" name="image-Bra6RQKJcw8PbxKtFqW04.png"/>
             <a:graphic>
               <a:graphicData uri="http://schemas.openxmlformats.org/drawingml/2006/picture">
                 <pic:pic>
                   <pic:nvPicPr>
-                    <pic:cNvPr id="12" name="image-ETXEUFoBaYg0ACkJiYjBL.png" descr=""/>
+                    <pic:cNvPr id="12" name="image-Bra6RQKJcw8PbxKtFqW04.png" descr=""/>
                     <pic:cNvPicPr/>
                   </pic:nvPicPr>
                   <pic:blipFill>
@@ -6990,12 +6990,12 @@
           <wp:inline distB="0" distL="0" distR="0" distT="0">
             <wp:extent cx="5972810" cy="3733006"/>
             <wp:effectExtent b="0" l="0" r="0" t="0"/>
-            <wp:docPr id="13" name="image-nCsHK_1zHJhw3WtiUlr6k.png"/>
+            <wp:docPr id="13" name="image-Rj6lC3-2IR10n53lpRlKw.png"/>
             <a:graphic>
               <a:graphicData uri="http://schemas.openxmlformats.org/drawingml/2006/picture">
                 <pic:pic>
                   <pic:nvPicPr>
-                    <pic:cNvPr id="13" name="image-nCsHK_1zHJhw3WtiUlr6k.png" descr=""/>
+                    <pic:cNvPr id="13" name="image-Rj6lC3-2IR10n53lpRlKw.png" descr=""/>
                     <pic:cNvPicPr/>
                   </pic:nvPicPr>
                   <pic:blipFill>
@@ -7045,12 +7045,12 @@
           <wp:inline distB="0" distL="0" distR="0" distT="0">
             <wp:extent cx="5972810" cy="3733006"/>
             <wp:effectExtent b="0" l="0" r="0" t="0"/>
-            <wp:docPr id="14" name="image-lnr6jJ3HPIHbaFRsu7mzc.png"/>
+            <wp:docPr id="14" name="image-Utg8cqJmtwlhXBWnmqigu.png"/>
             <a:graphic>
               <a:graphicData uri="http://schemas.openxmlformats.org/drawingml/2006/picture">
                 <pic:pic>
                   <pic:nvPicPr>
-                    <pic:cNvPr id="14" name="image-lnr6jJ3HPIHbaFRsu7mzc.png" descr=""/>
+                    <pic:cNvPr id="14" name="image-Utg8cqJmtwlhXBWnmqigu.png" descr=""/>
                     <pic:cNvPicPr/>
                   </pic:nvPicPr>
                   <pic:blipFill>
@@ -7100,12 +7100,12 @@
           <wp:inline distB="0" distL="0" distR="0" distT="0">
             <wp:extent cx="5972810" cy="3733006"/>
             <wp:effectExtent b="0" l="0" r="0" t="0"/>
-            <wp:docPr id="15" name="image-KhtO8ejMRdJRKOJPEVyVF.png"/>
+            <wp:docPr id="15" name="image--0dXYKa1XCZE-Tyf9s9p_.png"/>
             <a:graphic>
               <a:graphicData uri="http://schemas.openxmlformats.org/drawingml/2006/picture">
                 <pic:pic>
                   <pic:nvPicPr>
-                    <pic:cNvPr id="15" name="image-KhtO8ejMRdJRKOJPEVyVF.png" descr=""/>
+                    <pic:cNvPr id="15" name="image--0dXYKa1XCZE-Tyf9s9p_.png" descr=""/>
                     <pic:cNvPicPr/>
                   </pic:nvPicPr>
                   <pic:blipFill>
@@ -7155,12 +7155,12 @@
           <wp:inline distB="0" distL="0" distR="0" distT="0">
             <wp:extent cx="5972810" cy="3733006"/>
             <wp:effectExtent b="0" l="0" r="0" t="0"/>
-            <wp:docPr id="16" name="image-OTkaOUiHb4xu-OD5OFXMY.png"/>
+            <wp:docPr id="16" name="image-GcgwoCB3eUdg5QrjyXsFb.png"/>
             <a:graphic>
               <a:graphicData uri="http://schemas.openxmlformats.org/drawingml/2006/picture">
                 <pic:pic>
                   <pic:nvPicPr>
-                    <pic:cNvPr id="16" name="image-OTkaOUiHb4xu-OD5OFXMY.png" descr=""/>
+                    <pic:cNvPr id="16" name="image-GcgwoCB3eUdg5QrjyXsFb.png" descr=""/>
                     <pic:cNvPicPr/>
                   </pic:nvPicPr>
                   <pic:blipFill>
@@ -7210,12 +7210,12 @@
           <wp:inline distB="0" distL="0" distR="0" distT="0">
             <wp:extent cx="5972810" cy="3733006"/>
             <wp:effectExtent b="0" l="0" r="0" t="0"/>
-            <wp:docPr id="17" name="image-n7Oanz_6FWFCdOOZyLIp4.png"/>
+            <wp:docPr id="17" name="image-cn1VT0caMZeEo0ZLJmvKg.png"/>
             <a:graphic>
               <a:graphicData uri="http://schemas.openxmlformats.org/drawingml/2006/picture">
                 <pic:pic>
                   <pic:nvPicPr>
-                    <pic:cNvPr id="17" name="image-n7Oanz_6FWFCdOOZyLIp4.png" descr=""/>
+                    <pic:cNvPr id="17" name="image-cn1VT0caMZeEo0ZLJmvKg.png" descr=""/>
                     <pic:cNvPicPr/>
                   </pic:nvPicPr>
                   <pic:blipFill>

</xml_diff>